<commit_message>
feat/0.1.3: update version compendium + class implementation for 5 first level of 5 first classes
</commit_message>
<xml_diff>
--- a/doc/Classes_by_level.docx
+++ b/doc/Classes_by_level.docx
@@ -816,6 +816,20 @@
         <w:pStyle w:val="Titre2"/>
         <w:spacing w:before="0"/>
       </w:pPr>
+      <w:r>
+        <w:t xml:space="preserve">Jusqu’au niveau </w:t>
+      </w:r>
+      <w:r>
+        <w:t>6</w:t>
+      </w:r>
+      <w:r>
+        <w:t> : Choisir parmi 12 mana, 4 action, 2 critique, 2 zèle, 1pioche, 1 main</w:t>
+      </w:r>
+    </w:p>
+    <w:p>
+      <w:r>
+        <w:t>(15 sur 22) (+3 attributs par niveau)</w:t>
+      </w:r>
     </w:p>
     <w:p>
       <w:pPr>
@@ -830,6 +844,12 @@
         </w:rPr>
         <w:t>Niveau 1 :</w:t>
       </w:r>
+      <w:r>
+        <w:rPr>
+          <w:u w:val="single"/>
+        </w:rPr>
+        <w:t xml:space="preserve"> </w:t>
+      </w:r>
     </w:p>
     <w:p>
       <w:pPr>
@@ -883,36 +903,139 @@
     <w:p>
       <w:pPr>
         <w:spacing w:after="0"/>
-      </w:pPr>
-      <w:r>
-        <w:rPr>
-          <w:u w:val="single"/>
-        </w:rPr>
-        <w:t>Niveau 2 : +2 mana</w:t>
-      </w:r>
-      <w:r>
-        <w:rPr>
-          <w:u w:val="single"/>
-        </w:rPr>
-        <w:t xml:space="preserve"> +1 point d’action</w:t>
-      </w:r>
-      <w:r>
-        <w:rPr>
-          <w:u w:val="single"/>
-        </w:rPr>
+        <w:rPr>
+          <w:u w:val="single"/>
+        </w:rPr>
+      </w:pPr>
+      <w:r>
+        <w:rPr>
+          <w:u w:val="single"/>
+        </w:rPr>
+        <w:t>Niveau 2 </w:t>
+      </w:r>
+      <w:r>
+        <w:rPr>
+          <w:u w:val="single"/>
+        </w:rPr>
+        <w:t xml:space="preserve">: </w:t>
+      </w:r>
+    </w:p>
+    <w:p>
+      <w:pPr>
+        <w:spacing w:after="0"/>
+      </w:pPr>
+      <w:r>
+        <w:rPr>
+          <w:u w:val="single"/>
+        </w:rPr>
+        <w:t>Sorts</w:t>
+      </w:r>
+      <w:r>
+        <w:rPr>
+          <w:u w:val="single"/>
+        </w:rPr>
+        <w:t xml:space="preserve"> +5</w:t>
+      </w:r>
+      <w:r>
+        <w:rPr>
+          <w:u w:val="single"/>
+        </w:rPr>
+        <w:t> </w:t>
+      </w:r>
+      <w:r>
+        <w:rPr>
+          <w:u w:val="single"/>
+        </w:rPr>
+        <w:t>(12)</w:t>
+      </w:r>
+      <w:r>
+        <w:rPr>
+          <w:u w:val="single"/>
+        </w:rPr>
+        <w:t>:</w:t>
+      </w:r>
+      <w:r>
         <w:t xml:space="preserve"> </w:t>
       </w:r>
       <w:r>
-        <w:rPr>
-          <w:u w:val="single"/>
-        </w:rPr>
-        <w:t>/ +1 critique</w:t>
-      </w:r>
-      <w:r>
-        <w:rPr>
-          <w:u w:val="single"/>
-        </w:rPr>
-        <w:t xml:space="preserve"> +1 zèle</w:t>
+        <w:t xml:space="preserve">Pioche, Captation de mana, </w:t>
+      </w:r>
+      <w:proofErr w:type="spellStart"/>
+      <w:r>
+        <w:t>givrefeu</w:t>
+      </w:r>
+      <w:proofErr w:type="spellEnd"/>
+      <w:r>
+        <w:t>, brouillard, tornade</w:t>
+      </w:r>
+    </w:p>
+    <w:p>
+      <w:pPr>
+        <w:spacing w:after="0"/>
+      </w:pPr>
+      <w:r>
+        <w:rPr>
+          <w:u w:val="single"/>
+        </w:rPr>
+        <w:t>Sorts de base</w:t>
+      </w:r>
+      <w:r>
+        <w:rPr>
+          <w:u w:val="single"/>
+        </w:rPr>
+        <w:t xml:space="preserve"> spécialisé</w:t>
+      </w:r>
+      <w:r>
+        <w:rPr>
+          <w:u w:val="single"/>
+        </w:rPr>
+        <w:t> :</w:t>
+      </w:r>
+      <w:r>
+        <w:t xml:space="preserve"> </w:t>
+      </w:r>
+      <w:r>
+        <w:t xml:space="preserve">2 </w:t>
+      </w:r>
+      <w:r>
+        <w:t xml:space="preserve">Choix </w:t>
+      </w:r>
+      <w:r>
+        <w:t>parmi</w:t>
+      </w:r>
+      <w:r>
+        <w:t xml:space="preserve"> les 4 Contrôles des éléments</w:t>
+      </w:r>
+      <w:r>
+        <w:t xml:space="preserve"> </w:t>
+      </w:r>
+      <w:r>
+        <w:t>(rang1)</w:t>
+      </w:r>
+    </w:p>
+    <w:p>
+      <w:pPr>
+        <w:spacing w:after="0"/>
+      </w:pPr>
+    </w:p>
+    <w:p>
+      <w:pPr>
+        <w:spacing w:after="0"/>
+        <w:rPr>
+          <w:u w:val="single"/>
+        </w:rPr>
+      </w:pPr>
+      <w:r>
+        <w:rPr>
+          <w:u w:val="single"/>
+        </w:rPr>
+        <w:t>Niveau 3 </w:t>
+      </w:r>
+      <w:r>
+        <w:rPr>
+          <w:u w:val="single"/>
+        </w:rPr>
+        <w:t xml:space="preserve">: </w:t>
       </w:r>
     </w:p>
     <w:p>
@@ -929,7 +1052,7 @@
         <w:rPr>
           <w:u w:val="single"/>
         </w:rPr>
-        <w:t xml:space="preserve"> +5</w:t>
+        <w:t xml:space="preserve"> +6</w:t>
       </w:r>
       <w:r>
         <w:rPr>
@@ -941,7 +1064,7 @@
         <w:rPr>
           <w:u w:val="single"/>
         </w:rPr>
-        <w:t>(12)</w:t>
+        <w:t>(18)</w:t>
       </w:r>
       <w:r>
         <w:rPr>
@@ -950,105 +1073,246 @@
         <w:t>:</w:t>
       </w:r>
       <w:r>
+        <w:rPr>
+          <w:u w:val="single"/>
+        </w:rPr>
         <w:t xml:space="preserve"> </w:t>
       </w:r>
       <w:r>
-        <w:t xml:space="preserve">Pioche, Captation de mana, </w:t>
-      </w:r>
-      <w:proofErr w:type="spellStart"/>
-      <w:r>
-        <w:t>givrefeu</w:t>
-      </w:r>
-      <w:proofErr w:type="spellEnd"/>
-      <w:r>
-        <w:t>, brouillard, tornade</w:t>
-      </w:r>
-    </w:p>
-    <w:p>
-      <w:pPr>
-        <w:spacing w:after="0"/>
-      </w:pPr>
-      <w:r>
-        <w:rPr>
-          <w:u w:val="single"/>
-        </w:rPr>
+        <w:t>Booster de tour, tornade</w:t>
+      </w:r>
+      <w:r>
+        <w:t>, boule de feu, météore, frappe</w:t>
+      </w:r>
+      <w:r>
+        <w:t xml:space="preserve"> de givre, captation de mana</w:t>
+      </w:r>
+    </w:p>
+    <w:p>
+      <w:pPr>
+        <w:spacing w:after="0"/>
+      </w:pPr>
+      <w:r>
         <w:t>Sorts de base</w:t>
       </w:r>
-      <w:r>
-        <w:rPr>
-          <w:u w:val="single"/>
-        </w:rPr>
-        <w:t xml:space="preserve"> spécialisé</w:t>
-      </w:r>
-      <w:r>
-        <w:rPr>
-          <w:u w:val="single"/>
-        </w:rPr>
-        <w:t> :</w:t>
-      </w:r>
-      <w:r>
+    </w:p>
+    <w:p>
+      <w:pPr>
+        <w:spacing w:after="0"/>
+      </w:pPr>
+      <w:r>
+        <w:t>+1 sort D&amp;D</w:t>
+      </w:r>
+    </w:p>
+    <w:p>
+      <w:pPr>
+        <w:spacing w:after="0"/>
+      </w:pPr>
+    </w:p>
+    <w:p>
+      <w:pPr>
+        <w:spacing w:after="0"/>
+        <w:rPr>
+          <w:u w:val="single"/>
+        </w:rPr>
+      </w:pPr>
+      <w:r>
+        <w:rPr>
+          <w:u w:val="single"/>
+        </w:rPr>
+        <w:t xml:space="preserve">Niveau 4 : </w:t>
+      </w:r>
+    </w:p>
+    <w:p>
+      <w:pPr>
+        <w:spacing w:after="0"/>
+      </w:pPr>
+      <w:r>
+        <w:rPr>
+          <w:u w:val="single"/>
+        </w:rPr>
+        <w:t>Sorts</w:t>
+      </w:r>
+      <w:r>
+        <w:rPr>
+          <w:u w:val="single"/>
+        </w:rPr>
+        <w:t xml:space="preserve"> +8</w:t>
+      </w:r>
+      <w:r>
+        <w:rPr>
+          <w:u w:val="single"/>
+        </w:rPr>
+        <w:t> </w:t>
+      </w:r>
+      <w:r>
+        <w:rPr>
+          <w:u w:val="single"/>
+        </w:rPr>
+        <w:t>(</w:t>
+      </w:r>
+      <w:r>
+        <w:rPr>
+          <w:u w:val="single"/>
+        </w:rPr>
+        <w:t>26</w:t>
+      </w:r>
+      <w:r>
+        <w:rPr>
+          <w:u w:val="single"/>
+        </w:rPr>
+        <w:t>)</w:t>
+      </w:r>
+      <w:r>
+        <w:rPr>
+          <w:u w:val="single"/>
+        </w:rPr>
+        <w:t>:</w:t>
+      </w:r>
+      <w:r>
+        <w:rPr>
+          <w:u w:val="single"/>
+        </w:rPr>
         <w:t xml:space="preserve"> </w:t>
       </w:r>
       <w:r>
+        <w:t xml:space="preserve">fracture terrestre, incantation X2, pioche, boule de feu, onde glacée, propagation des dégâts, </w:t>
+      </w:r>
+      <w:r>
+        <w:t>choc</w:t>
+      </w:r>
+      <w:r>
+        <w:t xml:space="preserve"> de feu.</w:t>
+      </w:r>
+    </w:p>
+    <w:p>
+      <w:pPr>
+        <w:spacing w:after="0"/>
+      </w:pPr>
+      <w:r>
+        <w:t xml:space="preserve">Sorts de base : </w:t>
+      </w:r>
+      <w:r>
         <w:t xml:space="preserve">2 </w:t>
       </w:r>
       <w:r>
-        <w:t xml:space="preserve">Choix </w:t>
-      </w:r>
-      <w:r>
-        <w:t>parmi</w:t>
-      </w:r>
-      <w:r>
-        <w:t xml:space="preserve"> les 4 Contrôles des éléments</w:t>
+        <w:t>Choix parmi les 4 Contrôles des éléments</w:t>
       </w:r>
       <w:r>
         <w:t xml:space="preserve"> </w:t>
       </w:r>
       <w:r>
-        <w:t>(rang1)</w:t>
-      </w:r>
-    </w:p>
-    <w:p>
-      <w:pPr>
-        <w:spacing w:after="0"/>
-      </w:pPr>
-    </w:p>
-    <w:p>
-      <w:pPr>
-        <w:spacing w:after="0"/>
-      </w:pPr>
-      <w:r>
-        <w:rPr>
-          <w:u w:val="single"/>
-        </w:rPr>
-        <w:t xml:space="preserve">Niveau 3 : +3 mana / </w:t>
-      </w:r>
-      <w:r>
-        <w:rPr>
-          <w:u w:val="single"/>
-        </w:rPr>
-        <w:t xml:space="preserve">+1 mana </w:t>
-      </w:r>
-      <w:r>
-        <w:rPr>
-          <w:u w:val="single"/>
-        </w:rPr>
-        <w:t>+1 point d’action</w:t>
+        <w:t>(rang2)</w:t>
       </w:r>
       <w:r>
         <w:t xml:space="preserve"> </w:t>
       </w:r>
-      <w:r>
+    </w:p>
+    <w:p>
+      <w:pPr>
+        <w:spacing w:after="0"/>
+      </w:pPr>
+      <w:r>
+        <w:t>+1 sort D&amp;D</w:t>
+      </w:r>
+      <w:r>
+        <w:t xml:space="preserve"> (niveau 2 ?)</w:t>
+      </w:r>
+    </w:p>
+    <w:p>
+      <w:pPr>
+        <w:spacing w:after="0"/>
+      </w:pPr>
+    </w:p>
+    <w:p>
+      <w:pPr>
+        <w:spacing w:after="0"/>
         <w:rPr>
           <w:color w:val="FF0000"/>
         </w:rPr>
-        <w:t xml:space="preserve">+1 </w:t>
-      </w:r>
-      <w:r>
+      </w:pPr>
+      <w:r>
+        <w:rPr>
+          <w:u w:val="single"/>
+        </w:rPr>
+        <w:t>Niveau 5 </w:t>
+      </w:r>
+      <w:r>
+        <w:rPr>
+          <w:u w:val="single"/>
+        </w:rPr>
+        <w:t xml:space="preserve">: </w:t>
+      </w:r>
+    </w:p>
+    <w:p>
+      <w:pPr>
+        <w:spacing w:after="0"/>
         <w:rPr>
           <w:color w:val="FF0000"/>
         </w:rPr>
-        <w:t>main</w:t>
+      </w:pPr>
+      <w:r>
+        <w:tab/>
+      </w:r>
+      <w:r>
+        <w:rPr>
+          <w:color w:val="FF0000"/>
+        </w:rPr>
+        <w:t>Si &lt;</w:t>
+      </w:r>
+      <w:r>
+        <w:rPr>
+          <w:color w:val="FF0000"/>
+        </w:rPr>
+        <w:t>2</w:t>
+      </w:r>
+      <w:r>
+        <w:rPr>
+          <w:color w:val="FF0000"/>
+        </w:rPr>
+        <w:t>6</w:t>
+      </w:r>
+      <w:r>
+        <w:rPr>
+          <w:color w:val="FF0000"/>
+        </w:rPr>
+        <w:t xml:space="preserve"> </w:t>
+      </w:r>
+      <w:r>
+        <w:rPr>
+          <w:color w:val="FF0000"/>
+        </w:rPr>
+        <w:t xml:space="preserve">PV, </w:t>
+      </w:r>
+      <w:r>
+        <w:rPr>
+          <w:color w:val="FF0000"/>
+        </w:rPr>
+        <w:t>2</w:t>
+      </w:r>
+      <w:r>
+        <w:rPr>
+          <w:color w:val="FF0000"/>
+        </w:rPr>
+        <w:t>+ 1d</w:t>
+      </w:r>
+      <w:r>
+        <w:rPr>
+          <w:color w:val="FF0000"/>
+        </w:rPr>
+        <w:t>4</w:t>
+      </w:r>
+      <w:r>
+        <w:rPr>
+          <w:color w:val="FF0000"/>
+        </w:rPr>
+        <w:t xml:space="preserve"> points de vie ou +1 dégât</w:t>
+      </w:r>
+      <w:r>
+        <w:rPr>
+          <w:color w:val="FF0000"/>
+        </w:rPr>
+        <w:t xml:space="preserve"> général</w:t>
       </w:r>
     </w:p>
     <w:p>
@@ -1065,7 +1329,7 @@
         <w:rPr>
           <w:u w:val="single"/>
         </w:rPr>
-        <w:t xml:space="preserve"> +6</w:t>
+        <w:t xml:space="preserve"> +10</w:t>
       </w:r>
       <w:r>
         <w:rPr>
@@ -1077,7 +1341,7 @@
         <w:rPr>
           <w:u w:val="single"/>
         </w:rPr>
-        <w:t>(18)</w:t>
+        <w:t>(36)</w:t>
       </w:r>
       <w:r>
         <w:rPr>
@@ -1086,348 +1350,15 @@
         <w:t>:</w:t>
       </w:r>
       <w:r>
-        <w:rPr>
-          <w:u w:val="single"/>
-        </w:rPr>
-        <w:t xml:space="preserve"> </w:t>
-      </w:r>
-      <w:r>
-        <w:t>Booster de tour, tornade</w:t>
-      </w:r>
-      <w:r>
-        <w:t>, boule de feu, météore, frappe</w:t>
-      </w:r>
-      <w:r>
-        <w:t xml:space="preserve"> de givre, captation de mana</w:t>
-      </w:r>
-    </w:p>
-    <w:p>
-      <w:pPr>
-        <w:spacing w:after="0"/>
-      </w:pPr>
-      <w:r>
-        <w:t>Sorts de base</w:t>
-      </w:r>
-    </w:p>
-    <w:p>
-      <w:pPr>
-        <w:spacing w:after="0"/>
-      </w:pPr>
-      <w:r>
-        <w:t>+1 sort D&amp;D</w:t>
-      </w:r>
-    </w:p>
-    <w:p>
-      <w:pPr>
-        <w:spacing w:after="0"/>
-      </w:pPr>
-    </w:p>
-    <w:p>
-      <w:pPr>
-        <w:spacing w:after="0"/>
-      </w:pPr>
-      <w:r>
-        <w:rPr>
-          <w:u w:val="single"/>
-        </w:rPr>
-        <w:t xml:space="preserve">Niveau 4 : </w:t>
-      </w:r>
-      <w:r>
-        <w:rPr>
-          <w:u w:val="single"/>
-        </w:rPr>
-        <w:t>+2</w:t>
-      </w:r>
-      <w:r>
-        <w:rPr>
-          <w:u w:val="single"/>
-        </w:rPr>
-        <w:t xml:space="preserve"> </w:t>
-      </w:r>
-      <w:proofErr w:type="gramStart"/>
-      <w:r>
-        <w:rPr>
-          <w:u w:val="single"/>
-        </w:rPr>
-        <w:t>mana  +</w:t>
-      </w:r>
-      <w:proofErr w:type="gramEnd"/>
-      <w:r>
-        <w:rPr>
-          <w:u w:val="single"/>
-        </w:rPr>
-        <w:t>1 critique /</w:t>
-      </w:r>
-      <w:r>
-        <w:rPr>
-          <w:u w:val="single"/>
-        </w:rPr>
-        <w:t xml:space="preserve"> +1 mana </w:t>
-      </w:r>
-      <w:r>
-        <w:rPr>
-          <w:u w:val="single"/>
-        </w:rPr>
-        <w:t xml:space="preserve"> +1 point d’action</w:t>
-      </w:r>
-      <w:r>
-        <w:t xml:space="preserve"> </w:t>
-      </w:r>
-      <w:r>
+        <w:t xml:space="preserve"> booster de tour, captation de mana, tornade, fracture terrestre, frappe de givre, boule de feu, récupération de mana, assassin du néant, incantation, plastron magique</w:t>
+      </w:r>
+    </w:p>
+    <w:p>
+      <w:pPr>
+        <w:spacing w:after="0"/>
         <w:rPr>
           <w:color w:val="FF0000"/>
         </w:rPr>
-        <w:t>+1 pioche</w:t>
-      </w:r>
-    </w:p>
-    <w:p>
-      <w:pPr>
-        <w:spacing w:after="0"/>
-      </w:pPr>
-      <w:r>
-        <w:rPr>
-          <w:u w:val="single"/>
-        </w:rPr>
-        <w:t>Sorts</w:t>
-      </w:r>
-      <w:r>
-        <w:rPr>
-          <w:u w:val="single"/>
-        </w:rPr>
-        <w:t xml:space="preserve"> +8</w:t>
-      </w:r>
-      <w:r>
-        <w:rPr>
-          <w:u w:val="single"/>
-        </w:rPr>
-        <w:t> </w:t>
-      </w:r>
-      <w:r>
-        <w:rPr>
-          <w:u w:val="single"/>
-        </w:rPr>
-        <w:t>(</w:t>
-      </w:r>
-      <w:r>
-        <w:rPr>
-          <w:u w:val="single"/>
-        </w:rPr>
-        <w:t>26</w:t>
-      </w:r>
-      <w:r>
-        <w:rPr>
-          <w:u w:val="single"/>
-        </w:rPr>
-        <w:t>)</w:t>
-      </w:r>
-      <w:r>
-        <w:rPr>
-          <w:u w:val="single"/>
-        </w:rPr>
-        <w:t>:</w:t>
-      </w:r>
-      <w:r>
-        <w:rPr>
-          <w:u w:val="single"/>
-        </w:rPr>
-        <w:t xml:space="preserve"> </w:t>
-      </w:r>
-      <w:r>
-        <w:t xml:space="preserve">fracture terrestre, incantation X2, pioche, boule de feu, onde glacée, propagation des dégâts, </w:t>
-      </w:r>
-      <w:r>
-        <w:t>choc</w:t>
-      </w:r>
-      <w:r>
-        <w:t xml:space="preserve"> de feu.</w:t>
-      </w:r>
-    </w:p>
-    <w:p>
-      <w:pPr>
-        <w:spacing w:after="0"/>
-      </w:pPr>
-      <w:r>
-        <w:t xml:space="preserve">Sorts de base : </w:t>
-      </w:r>
-      <w:r>
-        <w:t xml:space="preserve">2 </w:t>
-      </w:r>
-      <w:r>
-        <w:t>Choix parmi les 4 Contrôles des éléments</w:t>
-      </w:r>
-      <w:r>
-        <w:t xml:space="preserve"> </w:t>
-      </w:r>
-      <w:r>
-        <w:t>(rang2)</w:t>
-      </w:r>
-      <w:r>
-        <w:t xml:space="preserve"> </w:t>
-      </w:r>
-    </w:p>
-    <w:p>
-      <w:pPr>
-        <w:spacing w:after="0"/>
-      </w:pPr>
-      <w:r>
-        <w:t>+1 sort D&amp;D</w:t>
-      </w:r>
-      <w:r>
-        <w:t xml:space="preserve"> (niveau 2 ?)</w:t>
-      </w:r>
-    </w:p>
-    <w:p>
-      <w:pPr>
-        <w:spacing w:after="0"/>
-      </w:pPr>
-    </w:p>
-    <w:p>
-      <w:pPr>
-        <w:spacing w:after="0"/>
-        <w:rPr>
-          <w:color w:val="FF0000"/>
-        </w:rPr>
-      </w:pPr>
-      <w:r>
-        <w:rPr>
-          <w:u w:val="single"/>
-        </w:rPr>
-        <w:t>Niveau 5 :</w:t>
-      </w:r>
-      <w:r>
-        <w:rPr>
-          <w:u w:val="single"/>
-        </w:rPr>
-        <w:t xml:space="preserve"> +2</w:t>
-      </w:r>
-      <w:r>
-        <w:rPr>
-          <w:u w:val="single"/>
-        </w:rPr>
-        <w:t xml:space="preserve"> mana +1 </w:t>
-      </w:r>
-      <w:r>
-        <w:rPr>
-          <w:u w:val="single"/>
-        </w:rPr>
-        <w:t>point d’action / +2 mana et +1 zèle</w:t>
-      </w:r>
-      <w:r>
-        <w:t xml:space="preserve"> </w:t>
-      </w:r>
-    </w:p>
-    <w:p>
-      <w:pPr>
-        <w:spacing w:after="0"/>
-        <w:rPr>
-          <w:color w:val="FF0000"/>
-        </w:rPr>
-      </w:pPr>
-      <w:r>
-        <w:tab/>
-      </w:r>
-      <w:r>
-        <w:rPr>
-          <w:color w:val="FF0000"/>
-        </w:rPr>
-        <w:t>Si &lt;</w:t>
-      </w:r>
-      <w:r>
-        <w:rPr>
-          <w:color w:val="FF0000"/>
-        </w:rPr>
-        <w:t>2</w:t>
-      </w:r>
-      <w:r>
-        <w:rPr>
-          <w:color w:val="FF0000"/>
-        </w:rPr>
-        <w:t>6</w:t>
-      </w:r>
-      <w:r>
-        <w:rPr>
-          <w:color w:val="FF0000"/>
-        </w:rPr>
-        <w:t xml:space="preserve"> </w:t>
-      </w:r>
-      <w:r>
-        <w:rPr>
-          <w:color w:val="FF0000"/>
-        </w:rPr>
-        <w:t xml:space="preserve">PV, </w:t>
-      </w:r>
-      <w:r>
-        <w:rPr>
-          <w:color w:val="FF0000"/>
-        </w:rPr>
-        <w:t>2</w:t>
-      </w:r>
-      <w:r>
-        <w:rPr>
-          <w:color w:val="FF0000"/>
-        </w:rPr>
-        <w:t>+ 1d</w:t>
-      </w:r>
-      <w:r>
-        <w:rPr>
-          <w:color w:val="FF0000"/>
-        </w:rPr>
-        <w:t>4</w:t>
-      </w:r>
-      <w:r>
-        <w:rPr>
-          <w:color w:val="FF0000"/>
-        </w:rPr>
-        <w:t xml:space="preserve"> points de vie ou +1 dégât</w:t>
-      </w:r>
-      <w:r>
-        <w:rPr>
-          <w:color w:val="FF0000"/>
-        </w:rPr>
-        <w:t xml:space="preserve"> général</w:t>
-      </w:r>
-    </w:p>
-    <w:p>
-      <w:pPr>
-        <w:spacing w:after="0"/>
-      </w:pPr>
-      <w:r>
-        <w:rPr>
-          <w:u w:val="single"/>
-        </w:rPr>
-        <w:t>Sorts</w:t>
-      </w:r>
-      <w:r>
-        <w:rPr>
-          <w:u w:val="single"/>
-        </w:rPr>
-        <w:t xml:space="preserve"> +10</w:t>
-      </w:r>
-      <w:r>
-        <w:rPr>
-          <w:u w:val="single"/>
-        </w:rPr>
-        <w:t> </w:t>
-      </w:r>
-      <w:r>
-        <w:rPr>
-          <w:u w:val="single"/>
-        </w:rPr>
-        <w:t>(36)</w:t>
-      </w:r>
-      <w:r>
-        <w:rPr>
-          <w:u w:val="single"/>
-        </w:rPr>
-        <w:t>:</w:t>
-      </w:r>
-      <w:r>
-        <w:t xml:space="preserve"> booster de tour, captation de mana, tornade, fracture terrestre, frappe de givre, boule de feu, récupération de mana, assassin du néant, incantation, plastron magique</w:t>
-      </w:r>
-    </w:p>
-    <w:p>
-      <w:pPr>
-        <w:spacing w:after="0"/>
       </w:pPr>
       <w:r>
         <w:t xml:space="preserve">Sorts de base : </w:t>
@@ -1835,7 +1766,7 @@
           </w:tcPr>
           <w:p>
             <w:r>
-              <w:t>4</w:t>
+              <w:t>3</w:t>
             </w:r>
           </w:p>
         </w:tc>
@@ -1845,7 +1776,7 @@
           </w:tcPr>
           <w:p>
             <w:r>
-              <w:t>4</w:t>
+              <w:t>3</w:t>
             </w:r>
           </w:p>
         </w:tc>
@@ -2192,6 +2123,71 @@
     </w:p>
     <w:p>
       <w:pPr>
+        <w:pStyle w:val="Titre2"/>
+        <w:spacing w:before="0"/>
+      </w:pPr>
+      <w:r>
+        <w:t>Jusqu’au niveau 6</w:t>
+      </w:r>
+      <w:r>
+        <w:t xml:space="preserve"> : </w:t>
+      </w:r>
+      <w:r>
+        <w:t xml:space="preserve">Choisir parmi </w:t>
+      </w:r>
+      <w:r>
+        <w:t>4</w:t>
+      </w:r>
+      <w:r>
+        <w:t xml:space="preserve"> mana, </w:t>
+      </w:r>
+      <w:r>
+        <w:t xml:space="preserve">6 </w:t>
+      </w:r>
+      <w:r>
+        <w:t xml:space="preserve">action, </w:t>
+      </w:r>
+      <w:r>
+        <w:t>2</w:t>
+      </w:r>
+      <w:r>
+        <w:t xml:space="preserve"> critique,</w:t>
+      </w:r>
+      <w:r>
+        <w:t xml:space="preserve"> </w:t>
+      </w:r>
+      <w:r>
+        <w:t>2</w:t>
+      </w:r>
+      <w:r>
+        <w:t xml:space="preserve"> </w:t>
+      </w:r>
+      <w:r>
+        <w:t>esquive</w:t>
+      </w:r>
+      <w:r>
+        <w:t xml:space="preserve">, 2 zèle, 1pioche, </w:t>
+      </w:r>
+      <w:r>
+        <w:t xml:space="preserve">2 déplacement, </w:t>
+      </w:r>
+      <w:r>
+        <w:t>3</w:t>
+      </w:r>
+      <w:r>
+        <w:t xml:space="preserve"> main</w:t>
+      </w:r>
+    </w:p>
+    <w:p>
+      <w:r>
+        <w:t>(15 sur 22)</w:t>
+      </w:r>
+      <w:r>
+        <w:t xml:space="preserve"> (+3 attributs par niveau)</w:t>
+      </w:r>
+    </w:p>
+    <w:p>
+      <w:pPr>
         <w:spacing w:after="0"/>
       </w:pPr>
       <w:r>
@@ -2203,6 +2199,12 @@
       <w:r>
         <w:t xml:space="preserve"> </w:t>
       </w:r>
+      <w:r>
+        <w:rPr>
+          <w:u w:val="single"/>
+        </w:rPr>
+        <w:t>:</w:t>
+      </w:r>
     </w:p>
     <w:p>
       <w:pPr>
@@ -2283,20 +2285,7 @@
         <w:rPr>
           <w:u w:val="single"/>
         </w:rPr>
-        <w:t>: +1esquive +1 zèle / +1 critique + 1mana</w:t>
-      </w:r>
-      <w:r>
-        <w:rPr>
-          <w:u w:val="single"/>
-        </w:rPr>
-        <w:t xml:space="preserve">:  </w:t>
-      </w:r>
-      <w:r>
-        <w:rPr>
-          <w:color w:val="FF0000"/>
-          <w:u w:val="single"/>
-        </w:rPr>
-        <w:t>+1 main</w:t>
+        <w:t>:</w:t>
       </w:r>
     </w:p>
     <w:p>
@@ -2432,349 +2421,205 @@
         <w:rPr>
           <w:u w:val="single"/>
         </w:rPr>
-        <w:t>: +1esquive +1mana</w:t>
-      </w:r>
-      <w:r>
-        <w:rPr>
-          <w:u w:val="single"/>
-        </w:rPr>
-        <w:t xml:space="preserve"> +1 point d’action</w:t>
-      </w:r>
-      <w:r>
-        <w:rPr>
-          <w:u w:val="single"/>
-        </w:rPr>
-        <w:t xml:space="preserve"> / +1 critique +1 zèle</w:t>
-      </w:r>
-      <w:r>
-        <w:rPr>
-          <w:u w:val="single"/>
-        </w:rPr>
-        <w:t xml:space="preserve"> +1 point d’action</w:t>
-      </w:r>
-      <w:r>
-        <w:rPr>
-          <w:u w:val="single"/>
-        </w:rPr>
         <w:t>:</w:t>
       </w:r>
+    </w:p>
+    <w:p>
+      <w:pPr>
+        <w:spacing w:after="0"/>
+      </w:pPr>
+      <w:r>
+        <w:rPr>
+          <w:u w:val="single"/>
+        </w:rPr>
+        <w:t>Sorts</w:t>
+      </w:r>
+      <w:r>
+        <w:rPr>
+          <w:u w:val="single"/>
+        </w:rPr>
+        <w:t xml:space="preserve"> +</w:t>
+      </w:r>
+      <w:r>
+        <w:rPr>
+          <w:u w:val="single"/>
+        </w:rPr>
+        <w:t>6</w:t>
+      </w:r>
+      <w:r>
+        <w:rPr>
+          <w:u w:val="single"/>
+        </w:rPr>
+        <w:t> </w:t>
+      </w:r>
+      <w:r>
+        <w:rPr>
+          <w:u w:val="single"/>
+        </w:rPr>
+        <w:t>(</w:t>
+      </w:r>
+      <w:r>
+        <w:rPr>
+          <w:u w:val="single"/>
+        </w:rPr>
+        <w:t>20</w:t>
+      </w:r>
+      <w:r>
+        <w:rPr>
+          <w:u w:val="single"/>
+        </w:rPr>
+        <w:t>)</w:t>
+      </w:r>
+      <w:r>
+        <w:rPr>
+          <w:u w:val="single"/>
+        </w:rPr>
+        <w:t>:</w:t>
+      </w:r>
+      <w:r>
+        <w:t xml:space="preserve"> Pioche III, Succion de mana, </w:t>
+      </w:r>
+      <w:r>
+        <w:t xml:space="preserve">Passage vers le plan éthéré, ShurikenX2, Shuriken </w:t>
+      </w:r>
+      <w:proofErr w:type="spellStart"/>
+      <w:r>
+        <w:t>empoisonée</w:t>
+      </w:r>
+      <w:proofErr w:type="spellEnd"/>
+    </w:p>
+    <w:p>
+      <w:pPr>
+        <w:spacing w:after="0"/>
+      </w:pPr>
+      <w:r>
+        <w:t>Sorts de base</w:t>
+      </w:r>
+    </w:p>
+    <w:p>
+      <w:pPr>
+        <w:spacing w:after="0"/>
+      </w:pPr>
+      <w:r>
+        <w:t>+1 sort D&amp;D</w:t>
+      </w:r>
+    </w:p>
+    <w:p>
+      <w:pPr>
+        <w:spacing w:after="0"/>
+        <w:rPr>
+          <w:u w:val="single"/>
+        </w:rPr>
+      </w:pPr>
+      <w:r>
+        <w:rPr>
+          <w:u w:val="single"/>
+        </w:rPr>
+        <w:t>Niveau 4 </w:t>
+      </w:r>
+      <w:r>
+        <w:rPr>
+          <w:u w:val="single"/>
+        </w:rPr>
+        <w:t>:</w:t>
+      </w:r>
+    </w:p>
+    <w:p>
+      <w:pPr>
+        <w:spacing w:after="0"/>
+      </w:pPr>
+      <w:r>
+        <w:rPr>
+          <w:u w:val="single"/>
+        </w:rPr>
+        <w:t>Sorts</w:t>
+      </w:r>
+      <w:r>
+        <w:rPr>
+          <w:u w:val="single"/>
+        </w:rPr>
+        <w:t xml:space="preserve"> +</w:t>
+      </w:r>
+      <w:r>
+        <w:rPr>
+          <w:u w:val="single"/>
+        </w:rPr>
+        <w:t>8</w:t>
+      </w:r>
+      <w:r>
+        <w:rPr>
+          <w:u w:val="single"/>
+        </w:rPr>
+        <w:t> </w:t>
+      </w:r>
+      <w:r>
+        <w:rPr>
+          <w:u w:val="single"/>
+        </w:rPr>
+        <w:t>(</w:t>
+      </w:r>
+      <w:r>
+        <w:rPr>
+          <w:u w:val="single"/>
+        </w:rPr>
+        <w:t>28</w:t>
+      </w:r>
+      <w:r>
+        <w:rPr>
+          <w:u w:val="single"/>
+        </w:rPr>
+        <w:t>)</w:t>
+      </w:r>
+      <w:r>
+        <w:rPr>
+          <w:u w:val="single"/>
+        </w:rPr>
+        <w:t>:</w:t>
+      </w:r>
+    </w:p>
+    <w:p>
+      <w:pPr>
+        <w:spacing w:after="0"/>
+      </w:pPr>
+      <w:r>
+        <w:t>Sorts de base :</w:t>
+      </w:r>
+      <w:r>
+        <w:t xml:space="preserve"> Allonge magique X2, Apothicaire</w:t>
+      </w:r>
+      <w:r>
+        <w:t xml:space="preserve"> 1</w:t>
+      </w:r>
+      <w:r>
+        <w:t>, attaque diagonale, Peste Noire, Vases communicants, Danse enfiévrée</w:t>
+      </w:r>
+      <w:r>
+        <w:t>, Images Miroir</w:t>
+      </w:r>
+    </w:p>
+    <w:p>
+      <w:pPr>
+        <w:spacing w:after="0"/>
+      </w:pPr>
+    </w:p>
+    <w:p>
+      <w:pPr>
+        <w:spacing w:after="0"/>
+        <w:rPr>
+          <w:color w:val="FF0000"/>
+        </w:rPr>
+      </w:pPr>
+      <w:r>
+        <w:rPr>
+          <w:u w:val="single"/>
+        </w:rPr>
+        <w:t>Niveau 5</w:t>
+      </w:r>
       <w:r>
         <w:rPr>
           <w:u w:val="single"/>
         </w:rPr>
         <w:t xml:space="preserve"> </w:t>
-      </w:r>
-      <w:r>
-        <w:rPr>
-          <w:u w:val="single"/>
-        </w:rPr>
-        <w:t xml:space="preserve"> </w:t>
-      </w:r>
-      <w:r>
-        <w:rPr>
-          <w:color w:val="FF0000"/>
-          <w:u w:val="single"/>
-        </w:rPr>
-        <w:t>+1 main</w:t>
-      </w:r>
-    </w:p>
-    <w:p>
-      <w:pPr>
-        <w:spacing w:after="0"/>
-      </w:pPr>
-      <w:r>
-        <w:rPr>
-          <w:u w:val="single"/>
-        </w:rPr>
-        <w:t>Sorts</w:t>
-      </w:r>
-      <w:r>
-        <w:rPr>
-          <w:u w:val="single"/>
-        </w:rPr>
-        <w:t xml:space="preserve"> +</w:t>
-      </w:r>
-      <w:r>
-        <w:rPr>
-          <w:u w:val="single"/>
-        </w:rPr>
-        <w:t>6</w:t>
-      </w:r>
-      <w:r>
-        <w:rPr>
-          <w:u w:val="single"/>
-        </w:rPr>
-        <w:t> </w:t>
-      </w:r>
-      <w:r>
-        <w:rPr>
-          <w:u w:val="single"/>
-        </w:rPr>
-        <w:t>(</w:t>
-      </w:r>
-      <w:r>
-        <w:rPr>
-          <w:u w:val="single"/>
-        </w:rPr>
-        <w:t>20</w:t>
-      </w:r>
-      <w:r>
-        <w:rPr>
-          <w:u w:val="single"/>
-        </w:rPr>
-        <w:t>)</w:t>
-      </w:r>
-      <w:r>
-        <w:rPr>
-          <w:u w:val="single"/>
-        </w:rPr>
-        <w:t>:</w:t>
-      </w:r>
-      <w:r>
-        <w:t xml:space="preserve"> Pioche III, Succion de mana, </w:t>
-      </w:r>
-      <w:r>
-        <w:t xml:space="preserve">Passage vers le plan éthéré, ShurikenX2, Shuriken </w:t>
-      </w:r>
-      <w:proofErr w:type="spellStart"/>
-      <w:r>
-        <w:t>empoisonée</w:t>
-      </w:r>
-      <w:proofErr w:type="spellEnd"/>
-    </w:p>
-    <w:p>
-      <w:pPr>
-        <w:spacing w:after="0"/>
-      </w:pPr>
-      <w:r>
-        <w:t>Sorts de base</w:t>
-      </w:r>
-    </w:p>
-    <w:p>
-      <w:pPr>
-        <w:spacing w:after="0"/>
-      </w:pPr>
-      <w:r>
-        <w:t>+1 sort D&amp;D</w:t>
-      </w:r>
-    </w:p>
-    <w:p>
-      <w:pPr>
-        <w:spacing w:after="0"/>
-      </w:pPr>
-      <w:r>
-        <w:rPr>
-          <w:u w:val="single"/>
-        </w:rPr>
-        <w:t>Niveau 4 </w:t>
-      </w:r>
-      <w:r>
-        <w:rPr>
-          <w:u w:val="single"/>
-        </w:rPr>
-        <w:t xml:space="preserve">: +1esquive +1 </w:t>
-      </w:r>
-      <w:r>
-        <w:rPr>
-          <w:u w:val="single"/>
-        </w:rPr>
-        <w:t>déplacement</w:t>
-      </w:r>
-      <w:r>
-        <w:rPr>
-          <w:u w:val="single"/>
-        </w:rPr>
-        <w:t xml:space="preserve"> +1 point d’action</w:t>
-      </w:r>
-      <w:r>
-        <w:rPr>
-          <w:u w:val="single"/>
-        </w:rPr>
-        <w:t xml:space="preserve"> / +1 critique +1</w:t>
-      </w:r>
-      <w:proofErr w:type="gramStart"/>
-      <w:r>
-        <w:rPr>
-          <w:u w:val="single"/>
-        </w:rPr>
-        <w:t>mana</w:t>
-      </w:r>
-      <w:r>
-        <w:rPr>
-          <w:u w:val="single"/>
-        </w:rPr>
-        <w:t xml:space="preserve">  +</w:t>
-      </w:r>
-      <w:proofErr w:type="gramEnd"/>
-      <w:r>
-        <w:rPr>
-          <w:u w:val="single"/>
-        </w:rPr>
-        <w:t>1 point d’action</w:t>
-      </w:r>
-      <w:r>
-        <w:rPr>
-          <w:u w:val="single"/>
-        </w:rPr>
-        <w:t xml:space="preserve">: </w:t>
-      </w:r>
-      <w:r>
-        <w:rPr>
-          <w:color w:val="FF0000"/>
-          <w:u w:val="single"/>
-        </w:rPr>
-        <w:t>+1 pioche</w:t>
-      </w:r>
-    </w:p>
-    <w:p>
-      <w:pPr>
-        <w:spacing w:after="0"/>
-      </w:pPr>
-      <w:r>
-        <w:rPr>
-          <w:u w:val="single"/>
-        </w:rPr>
-        <w:t>Sorts</w:t>
-      </w:r>
-      <w:r>
-        <w:rPr>
-          <w:u w:val="single"/>
-        </w:rPr>
-        <w:t xml:space="preserve"> +</w:t>
-      </w:r>
-      <w:r>
-        <w:rPr>
-          <w:u w:val="single"/>
-        </w:rPr>
-        <w:t>8</w:t>
-      </w:r>
-      <w:r>
-        <w:rPr>
-          <w:u w:val="single"/>
-        </w:rPr>
-        <w:t> </w:t>
-      </w:r>
-      <w:r>
-        <w:rPr>
-          <w:u w:val="single"/>
-        </w:rPr>
-        <w:t>(</w:t>
-      </w:r>
-      <w:r>
-        <w:rPr>
-          <w:u w:val="single"/>
-        </w:rPr>
-        <w:t>28</w:t>
-      </w:r>
-      <w:r>
-        <w:rPr>
-          <w:u w:val="single"/>
-        </w:rPr>
-        <w:t>)</w:t>
-      </w:r>
-      <w:r>
-        <w:rPr>
-          <w:u w:val="single"/>
-        </w:rPr>
-        <w:t>:</w:t>
-      </w:r>
-    </w:p>
-    <w:p>
-      <w:pPr>
-        <w:spacing w:after="0"/>
-      </w:pPr>
-      <w:r>
-        <w:t>Sorts de base :</w:t>
-      </w:r>
-      <w:r>
-        <w:t xml:space="preserve"> Allonge magique X2, Apothicaire</w:t>
-      </w:r>
-      <w:r>
-        <w:t xml:space="preserve"> 1</w:t>
-      </w:r>
-      <w:r>
-        <w:t>, attaque diagonale, Peste Noire, Vases communicants, Danse enfiévrée</w:t>
-      </w:r>
-      <w:r>
-        <w:t>, Images Miroir</w:t>
-      </w:r>
-    </w:p>
-    <w:p>
-      <w:pPr>
-        <w:spacing w:after="0"/>
-      </w:pPr>
-    </w:p>
-    <w:p>
-      <w:pPr>
-        <w:spacing w:after="0"/>
-        <w:rPr>
-          <w:color w:val="FF0000"/>
-        </w:rPr>
-      </w:pPr>
-      <w:r>
-        <w:rPr>
-          <w:u w:val="single"/>
-        </w:rPr>
-        <w:t>Niveau 5 </w:t>
-      </w:r>
-      <w:r>
-        <w:rPr>
-          <w:u w:val="single"/>
-        </w:rPr>
-        <w:t xml:space="preserve">: +1esquive +1 </w:t>
-      </w:r>
-      <w:proofErr w:type="gramStart"/>
-      <w:r>
-        <w:rPr>
-          <w:u w:val="single"/>
-        </w:rPr>
-        <w:t>mana</w:t>
-      </w:r>
-      <w:r>
-        <w:rPr>
-          <w:u w:val="single"/>
-        </w:rPr>
-        <w:t xml:space="preserve">  +</w:t>
-      </w:r>
-      <w:proofErr w:type="gramEnd"/>
-      <w:r>
-        <w:rPr>
-          <w:u w:val="single"/>
-        </w:rPr>
-        <w:t>1 point d’action</w:t>
-      </w:r>
-      <w:r>
-        <w:rPr>
-          <w:u w:val="single"/>
-        </w:rPr>
-        <w:t xml:space="preserve"> / +1 critique +1 </w:t>
-      </w:r>
-      <w:proofErr w:type="spellStart"/>
-      <w:r>
-        <w:rPr>
-          <w:u w:val="single"/>
-        </w:rPr>
-        <w:t>deplacement</w:t>
-      </w:r>
-      <w:proofErr w:type="spellEnd"/>
-      <w:r>
-        <w:rPr>
-          <w:u w:val="single"/>
-        </w:rPr>
-        <w:t xml:space="preserve">  +1 point d’action</w:t>
-      </w:r>
-      <w:r>
-        <w:rPr>
-          <w:u w:val="single"/>
-        </w:rPr>
-        <w:t xml:space="preserve">: </w:t>
-      </w:r>
-      <w:r>
-        <w:rPr>
-          <w:color w:val="FF0000"/>
-          <w:u w:val="single"/>
-        </w:rPr>
-        <w:t>+1 main</w:t>
       </w:r>
     </w:p>
     <w:p>
@@ -3187,7 +3032,7 @@
               <w:t>1</w:t>
             </w:r>
             <w:r>
-              <w:t>0</w:t>
+              <w:t>1</w:t>
             </w:r>
           </w:p>
         </w:tc>
@@ -3614,6 +3459,62 @@
     </w:p>
     <w:p>
       <w:pPr>
+        <w:pStyle w:val="Titre2"/>
+        <w:spacing w:before="0"/>
+      </w:pPr>
+      <w:r>
+        <w:t xml:space="preserve">Chaque niveau : Choisir parmi </w:t>
+      </w:r>
+      <w:r>
+        <w:t>6</w:t>
+      </w:r>
+      <w:r>
+        <w:t xml:space="preserve"> mana, </w:t>
+      </w:r>
+      <w:r>
+        <w:t>8</w:t>
+      </w:r>
+      <w:r>
+        <w:t xml:space="preserve"> critique, 2 zèle, </w:t>
+      </w:r>
+      <w:r>
+        <w:t>1 main</w:t>
+      </w:r>
+      <w:r>
+        <w:t xml:space="preserve">, </w:t>
+      </w:r>
+      <w:r>
+        <w:t>1</w:t>
+      </w:r>
+      <w:r>
+        <w:t xml:space="preserve"> </w:t>
+      </w:r>
+      <w:r>
+        <w:t>pioche</w:t>
+      </w:r>
+      <w:r>
+        <w:t xml:space="preserve">, </w:t>
+      </w:r>
+      <w:r>
+        <w:t>2</w:t>
+      </w:r>
+      <w:r>
+        <w:t xml:space="preserve"> </w:t>
+      </w:r>
+      <w:r>
+        <w:t>déplacement</w:t>
+      </w:r>
+      <w:r>
+        <w:t>, 2 action</w:t>
+      </w:r>
+    </w:p>
+    <w:p>
+      <w:r>
+        <w:t>(15 sur 22) (+3 attributs par niveau)</w:t>
+      </w:r>
+    </w:p>
+    <w:p>
+      <w:pPr>
         <w:spacing w:after="0"/>
         <w:rPr>
           <w:u w:val="single"/>
@@ -3689,7 +3590,7 @@
         <w:rPr>
           <w:u w:val="single"/>
         </w:rPr>
-        <w:t>Niveau 2 : +1 mana +1 critique / +1 critique +1 zèle</w:t>
+        <w:t>Niveau 2 :</w:t>
       </w:r>
     </w:p>
     <w:p>
@@ -3790,14 +3691,12 @@
           <w:b/>
         </w:rPr>
       </w:pPr>
-      <w:proofErr w:type="gramStart"/>
       <w:r>
         <w:rPr>
           <w:b/>
         </w:rPr>
         <w:t>OU</w:t>
       </w:r>
-      <w:proofErr w:type="gramEnd"/>
     </w:p>
     <w:p>
       <w:pPr>
@@ -3829,7 +3728,42 @@
         <w:rPr>
           <w:u w:val="single"/>
         </w:rPr>
-        <w:t>Niveau 3 : +2 mana / +1 critique + 1mana</w:t>
+        <w:t>Niveau 3 </w:t>
+      </w:r>
+    </w:p>
+    <w:p>
+      <w:pPr>
+        <w:spacing w:after="0"/>
+      </w:pPr>
+      <w:r>
+        <w:rPr>
+          <w:u w:val="single"/>
+        </w:rPr>
+        <w:t>Sorts</w:t>
+      </w:r>
+      <w:r>
+        <w:rPr>
+          <w:u w:val="single"/>
+        </w:rPr>
+        <w:t xml:space="preserve"> +6</w:t>
+      </w:r>
+      <w:r>
+        <w:rPr>
+          <w:u w:val="single"/>
+        </w:rPr>
+        <w:t> </w:t>
+      </w:r>
+      <w:r>
+        <w:rPr>
+          <w:u w:val="single"/>
+        </w:rPr>
+        <w:t>(18)</w:t>
+      </w:r>
+      <w:r>
+        <w:rPr>
+          <w:u w:val="single"/>
+        </w:rPr>
+        <w:t>:</w:t>
       </w:r>
       <w:r>
         <w:rPr>
@@ -3838,16 +3772,208 @@
         <w:t xml:space="preserve"> </w:t>
       </w:r>
       <w:r>
+        <w:t>Tir empoison</w:t>
+      </w:r>
+      <w:r>
+        <w:t>né X2</w:t>
+      </w:r>
+      <w:r>
+        <w:t>,</w:t>
+      </w:r>
+      <w:r>
+        <w:t xml:space="preserve"> Tir transperçant,</w:t>
+      </w:r>
+      <w:r>
+        <w:t xml:space="preserve"> </w:t>
+      </w:r>
+      <w:r>
+        <w:t>Pioche, Tir précis, Booster de tour</w:t>
+      </w:r>
+    </w:p>
+    <w:p>
+      <w:pPr>
+        <w:spacing w:after="0"/>
+      </w:pPr>
+      <w:r>
+        <w:t>Sort de base</w:t>
+      </w:r>
+    </w:p>
+    <w:p>
+      <w:pPr>
+        <w:spacing w:after="0"/>
+      </w:pPr>
+    </w:p>
+    <w:p>
+      <w:pPr>
+        <w:spacing w:after="0"/>
+      </w:pPr>
+      <w:r>
+        <w:rPr>
+          <w:u w:val="single"/>
+        </w:rPr>
+        <w:t>Niveau 4 </w:t>
+      </w:r>
+    </w:p>
+    <w:p>
+      <w:pPr>
+        <w:spacing w:after="0"/>
+      </w:pPr>
+      <w:r>
+        <w:rPr>
+          <w:u w:val="single"/>
+        </w:rPr>
+        <w:t>Sorts</w:t>
+      </w:r>
+      <w:r>
+        <w:rPr>
+          <w:u w:val="single"/>
+        </w:rPr>
+        <w:t xml:space="preserve"> +9</w:t>
+      </w:r>
+      <w:r>
+        <w:rPr>
+          <w:u w:val="single"/>
+        </w:rPr>
+        <w:t> </w:t>
+      </w:r>
+      <w:r>
+        <w:rPr>
+          <w:u w:val="single"/>
+        </w:rPr>
+        <w:t>(2</w:t>
+      </w:r>
+      <w:r>
+        <w:rPr>
+          <w:u w:val="single"/>
+        </w:rPr>
+        <w:t>7</w:t>
+      </w:r>
+      <w:r>
+        <w:rPr>
+          <w:u w:val="single"/>
+        </w:rPr>
+        <w:t>)</w:t>
+      </w:r>
+      <w:r>
+        <w:rPr>
+          <w:u w:val="single"/>
+        </w:rPr>
+        <w:t>:</w:t>
+      </w:r>
+      <w:r>
+        <w:rPr>
+          <w:u w:val="single"/>
+        </w:rPr>
+        <w:t xml:space="preserve"> </w:t>
+      </w:r>
+    </w:p>
+    <w:p>
+      <w:pPr>
+        <w:spacing w:after="0"/>
+      </w:pPr>
+      <w:r>
+        <w:t xml:space="preserve">Sorts de base : </w:t>
+      </w:r>
+      <w:r>
+        <w:t>Tireur d’élite, Booster de tour, Double flèche</w:t>
+      </w:r>
+      <w:r>
+        <w:t>s</w:t>
+      </w:r>
+      <w:r>
+        <w:t xml:space="preserve">, Tir précis, Récupération de mana, </w:t>
+      </w:r>
+      <w:r>
+        <w:t>Embuscade X2, Traquenard, Pluie de flèche</w:t>
+      </w:r>
+      <w:r>
+        <w:t>s</w:t>
+      </w:r>
+    </w:p>
+    <w:p>
+      <w:pPr>
+        <w:spacing w:after="0"/>
+      </w:pPr>
+      <w:r>
+        <w:t>+1 sort D&amp;D</w:t>
+      </w:r>
+    </w:p>
+    <w:p>
+      <w:pPr>
+        <w:spacing w:after="0"/>
+      </w:pPr>
+    </w:p>
+    <w:p>
+      <w:pPr>
+        <w:spacing w:after="0"/>
         <w:rPr>
           <w:color w:val="FF0000"/>
         </w:rPr>
-        <w:t xml:space="preserve">+1 </w:t>
-      </w:r>
-      <w:r>
+      </w:pPr>
+      <w:r>
+        <w:rPr>
+          <w:u w:val="single"/>
+        </w:rPr>
+        <w:t>Niveau 5 :</w:t>
+      </w:r>
+    </w:p>
+    <w:p>
+      <w:pPr>
+        <w:spacing w:after="0"/>
         <w:rPr>
           <w:color w:val="FF0000"/>
         </w:rPr>
-        <w:t>main</w:t>
+      </w:pPr>
+      <w:r>
+        <w:tab/>
+      </w:r>
+      <w:r>
+        <w:rPr>
+          <w:color w:val="FF0000"/>
+        </w:rPr>
+        <w:t>Si &lt;</w:t>
+      </w:r>
+      <w:r>
+        <w:rPr>
+          <w:color w:val="FF0000"/>
+        </w:rPr>
+        <w:t>36</w:t>
+      </w:r>
+      <w:r>
+        <w:rPr>
+          <w:color w:val="FF0000"/>
+        </w:rPr>
+        <w:t xml:space="preserve"> PV,</w:t>
+      </w:r>
+      <w:r>
+        <w:rPr>
+          <w:color w:val="FF0000"/>
+        </w:rPr>
+        <w:t xml:space="preserve"> 2</w:t>
+      </w:r>
+      <w:r>
+        <w:rPr>
+          <w:color w:val="FF0000"/>
+        </w:rPr>
+        <w:t xml:space="preserve"> + 1d</w:t>
+      </w:r>
+      <w:r>
+        <w:rPr>
+          <w:color w:val="FF0000"/>
+        </w:rPr>
+        <w:t>6</w:t>
+      </w:r>
+      <w:r>
+        <w:rPr>
+          <w:color w:val="FF0000"/>
+        </w:rPr>
+        <w:t xml:space="preserve"> points de vie ou +1 dégât</w:t>
+      </w:r>
+      <w:r>
+        <w:rPr>
+          <w:color w:val="FF0000"/>
+        </w:rPr>
+        <w:t xml:space="preserve"> général</w:t>
       </w:r>
     </w:p>
     <w:p>
@@ -3864,7 +3990,13 @@
         <w:rPr>
           <w:u w:val="single"/>
         </w:rPr>
-        <w:t xml:space="preserve"> +6</w:t>
+        <w:t xml:space="preserve"> +</w:t>
+      </w:r>
+      <w:r>
+        <w:rPr>
+          <w:u w:val="single"/>
+        </w:rPr>
+        <w:t>9</w:t>
       </w:r>
       <w:r>
         <w:rPr>
@@ -3876,7 +4008,7 @@
         <w:rPr>
           <w:u w:val="single"/>
         </w:rPr>
-        <w:t>(18)</w:t>
+        <w:t>(36)</w:t>
       </w:r>
       <w:r>
         <w:rPr>
@@ -3884,139 +4016,6 @@
         </w:rPr>
         <w:t>:</w:t>
       </w:r>
-      <w:r>
-        <w:rPr>
-          <w:u w:val="single"/>
-        </w:rPr>
-        <w:t xml:space="preserve"> </w:t>
-      </w:r>
-      <w:r>
-        <w:t>Tir empoison</w:t>
-      </w:r>
-      <w:r>
-        <w:t>né X2</w:t>
-      </w:r>
-      <w:r>
-        <w:t>,</w:t>
-      </w:r>
-      <w:r>
-        <w:t xml:space="preserve"> Tir transperçant,</w:t>
-      </w:r>
-      <w:r>
-        <w:t xml:space="preserve"> </w:t>
-      </w:r>
-      <w:r>
-        <w:t>Pioche, Tir précis, Booster de tour</w:t>
-      </w:r>
-    </w:p>
-    <w:p>
-      <w:pPr>
-        <w:spacing w:after="0"/>
-      </w:pPr>
-      <w:r>
-        <w:t>Sort de base</w:t>
-      </w:r>
-    </w:p>
-    <w:p>
-      <w:pPr>
-        <w:spacing w:after="0"/>
-      </w:pPr>
-    </w:p>
-    <w:p>
-      <w:pPr>
-        <w:spacing w:after="0"/>
-      </w:pPr>
-      <w:r>
-        <w:rPr>
-          <w:u w:val="single"/>
-        </w:rPr>
-        <w:t xml:space="preserve">Niveau 4 : +1 </w:t>
-      </w:r>
-      <w:r>
-        <w:rPr>
-          <w:u w:val="single"/>
-        </w:rPr>
-        <w:t>déplacement +</w:t>
-      </w:r>
-      <w:r>
-        <w:rPr>
-          <w:u w:val="single"/>
-        </w:rPr>
-        <w:t xml:space="preserve">1 critique / +1 </w:t>
-      </w:r>
-      <w:proofErr w:type="gramStart"/>
-      <w:r>
-        <w:rPr>
-          <w:u w:val="single"/>
-        </w:rPr>
-        <w:t>zèle  +</w:t>
-      </w:r>
-      <w:proofErr w:type="gramEnd"/>
-      <w:r>
-        <w:rPr>
-          <w:u w:val="single"/>
-        </w:rPr>
-        <w:t>1 critique</w:t>
-      </w:r>
-      <w:r>
-        <w:rPr>
-          <w:color w:val="FF0000"/>
-        </w:rPr>
-        <w:t>+1 pioche</w:t>
-      </w:r>
-    </w:p>
-    <w:p>
-      <w:pPr>
-        <w:spacing w:after="0"/>
-      </w:pPr>
-      <w:r>
-        <w:rPr>
-          <w:u w:val="single"/>
-        </w:rPr>
-        <w:t>Sorts</w:t>
-      </w:r>
-      <w:r>
-        <w:rPr>
-          <w:u w:val="single"/>
-        </w:rPr>
-        <w:t xml:space="preserve"> +9</w:t>
-      </w:r>
-      <w:r>
-        <w:rPr>
-          <w:u w:val="single"/>
-        </w:rPr>
-        <w:t> </w:t>
-      </w:r>
-      <w:r>
-        <w:rPr>
-          <w:u w:val="single"/>
-        </w:rPr>
-        <w:t>(2</w:t>
-      </w:r>
-      <w:r>
-        <w:rPr>
-          <w:u w:val="single"/>
-        </w:rPr>
-        <w:t>7</w:t>
-      </w:r>
-      <w:r>
-        <w:rPr>
-          <w:u w:val="single"/>
-        </w:rPr>
-        <w:t>)</w:t>
-      </w:r>
-      <w:r>
-        <w:rPr>
-          <w:u w:val="single"/>
-        </w:rPr>
-        <w:t>:</w:t>
-      </w:r>
-      <w:r>
-        <w:rPr>
-          <w:u w:val="single"/>
-        </w:rPr>
-        <w:t xml:space="preserve"> </w:t>
-      </w:r>
     </w:p>
     <w:p>
       <w:pPr>
@@ -4026,206 +4025,19 @@
         <w:t xml:space="preserve">Sorts de base : </w:t>
       </w:r>
       <w:r>
-        <w:t>Tireur d’élite, Booster de tour, Double flèche</w:t>
-      </w:r>
-      <w:r>
-        <w:t>s</w:t>
-      </w:r>
-      <w:r>
-        <w:t xml:space="preserve">, Tir précis, Récupération de mana, </w:t>
-      </w:r>
-      <w:r>
-        <w:t>Embuscade X2, Traquenard, Pluie de flèche</w:t>
-      </w:r>
-      <w:r>
-        <w:t>s</w:t>
-      </w:r>
-    </w:p>
-    <w:p>
-      <w:pPr>
-        <w:spacing w:after="0"/>
-      </w:pPr>
-      <w:r>
-        <w:t>+1 sort D&amp;D</w:t>
-      </w:r>
-    </w:p>
-    <w:p>
-      <w:pPr>
-        <w:spacing w:after="0"/>
-      </w:pPr>
-    </w:p>
-    <w:p>
-      <w:pPr>
-        <w:spacing w:after="0"/>
-        <w:rPr>
-          <w:color w:val="FF0000"/>
-        </w:rPr>
-      </w:pPr>
-      <w:r>
-        <w:rPr>
-          <w:u w:val="single"/>
-        </w:rPr>
-        <w:t xml:space="preserve">Niveau 5 : +2 mana +1 critique/ +1 </w:t>
-      </w:r>
-      <w:proofErr w:type="spellStart"/>
-      <w:r>
-        <w:rPr>
-          <w:u w:val="single"/>
-        </w:rPr>
-        <w:t>deplacement</w:t>
-      </w:r>
-      <w:proofErr w:type="spellEnd"/>
-      <w:r>
-        <w:rPr>
-          <w:u w:val="single"/>
-        </w:rPr>
-        <w:t xml:space="preserve"> et +</w:t>
-      </w:r>
-      <w:r>
-        <w:rPr>
-          <w:u w:val="single"/>
-        </w:rPr>
-        <w:t>2</w:t>
-      </w:r>
-      <w:r>
-        <w:rPr>
-          <w:u w:val="single"/>
-        </w:rPr>
-        <w:t xml:space="preserve"> critique</w:t>
-      </w:r>
-      <w:r>
-        <w:t xml:space="preserve"> </w:t>
-      </w:r>
-    </w:p>
-    <w:p>
-      <w:pPr>
-        <w:spacing w:after="0"/>
-        <w:rPr>
-          <w:color w:val="FF0000"/>
-        </w:rPr>
-      </w:pPr>
-      <w:r>
-        <w:tab/>
-      </w:r>
-      <w:r>
-        <w:rPr>
-          <w:color w:val="FF0000"/>
-        </w:rPr>
-        <w:t>Si &lt;</w:t>
-      </w:r>
-      <w:r>
-        <w:rPr>
-          <w:color w:val="FF0000"/>
-        </w:rPr>
-        <w:t>36</w:t>
-      </w:r>
-      <w:r>
-        <w:rPr>
-          <w:color w:val="FF0000"/>
-        </w:rPr>
-        <w:t xml:space="preserve"> PV,</w:t>
-      </w:r>
-      <w:r>
-        <w:rPr>
-          <w:color w:val="FF0000"/>
-        </w:rPr>
-        <w:t xml:space="preserve"> 2</w:t>
-      </w:r>
-      <w:r>
-        <w:rPr>
-          <w:color w:val="FF0000"/>
-        </w:rPr>
-        <w:t xml:space="preserve"> + 1d</w:t>
-      </w:r>
-      <w:r>
-        <w:rPr>
-          <w:color w:val="FF0000"/>
-        </w:rPr>
-        <w:t>6</w:t>
-      </w:r>
-      <w:r>
-        <w:rPr>
-          <w:color w:val="FF0000"/>
-        </w:rPr>
-        <w:t xml:space="preserve"> points de vie ou +1 dégât</w:t>
-      </w:r>
-      <w:r>
-        <w:rPr>
-          <w:color w:val="FF0000"/>
-        </w:rPr>
-        <w:t xml:space="preserve"> général</w:t>
-      </w:r>
-    </w:p>
-    <w:p>
-      <w:pPr>
-        <w:spacing w:after="0"/>
-      </w:pPr>
-      <w:r>
-        <w:rPr>
-          <w:u w:val="single"/>
-        </w:rPr>
-        <w:t>Sorts</w:t>
-      </w:r>
-      <w:r>
-        <w:rPr>
-          <w:u w:val="single"/>
-        </w:rPr>
-        <w:t xml:space="preserve"> +</w:t>
-      </w:r>
-      <w:r>
-        <w:rPr>
-          <w:u w:val="single"/>
-        </w:rPr>
-        <w:t>9</w:t>
-      </w:r>
-      <w:r>
-        <w:rPr>
-          <w:u w:val="single"/>
-        </w:rPr>
-        <w:t> </w:t>
-      </w:r>
-      <w:r>
-        <w:rPr>
-          <w:u w:val="single"/>
-        </w:rPr>
-        <w:t>(36)</w:t>
-      </w:r>
-      <w:r>
-        <w:rPr>
-          <w:u w:val="single"/>
-        </w:rPr>
-        <w:t>:</w:t>
-      </w:r>
-    </w:p>
-    <w:p>
-      <w:pPr>
-        <w:spacing w:after="0"/>
-      </w:pPr>
-      <w:r>
-        <w:t xml:space="preserve">Sorts de base : </w:t>
-      </w:r>
-      <w:r>
         <w:t>Tir réflexe, Tir supersonique</w:t>
       </w:r>
       <w:r>
         <w:t xml:space="preserve"> X2</w:t>
       </w:r>
       <w:r>
-        <w:t xml:space="preserve">, Tir explosif X2, Tir </w:t>
-      </w:r>
-      <w:proofErr w:type="gramStart"/>
-      <w:r>
-        <w:t xml:space="preserve">précis </w:t>
+        <w:t xml:space="preserve">, Tir explosif X2, Tir précis </w:t>
       </w:r>
       <w:r>
         <w:t>,L</w:t>
       </w:r>
       <w:r>
-        <w:t>ouve</w:t>
-      </w:r>
-      <w:proofErr w:type="gramEnd"/>
-      <w:r>
-        <w:t xml:space="preserve"> apprivoisée, Tir </w:t>
+        <w:t xml:space="preserve">ouve apprivoisée, Tir </w:t>
       </w:r>
       <w:r>
         <w:t>empoisonné, Etude du point faible</w:t>
@@ -4269,7 +4081,6 @@
         <w:spacing w:before="0"/>
       </w:pPr>
       <w:r>
-        <w:lastRenderedPageBreak/>
         <w:t>Gladiateur :</w:t>
       </w:r>
     </w:p>
@@ -4722,18 +4533,6 @@
           <w:color w:val="00B0F0"/>
         </w:rPr>
       </w:pPr>
-      <w:r>
-        <w:rPr>
-          <w:color w:val="00B0F0"/>
-        </w:rPr>
-        <w:t>Dé de vie : 1d</w:t>
-      </w:r>
-      <w:r>
-        <w:rPr>
-          <w:color w:val="00B0F0"/>
-        </w:rPr>
-        <w:t>8</w:t>
-      </w:r>
     </w:p>
     <w:p>
       <w:pPr>
@@ -4922,6 +4721,43 @@
       <w:pPr>
         <w:spacing w:after="0"/>
         <w:rPr>
+          <w:color w:val="00B0F0"/>
+        </w:rPr>
+      </w:pPr>
+      <w:r>
+        <w:rPr>
+          <w:color w:val="00B0F0"/>
+        </w:rPr>
+        <w:t>Dé de vie : 1d</w:t>
+      </w:r>
+      <w:r>
+        <w:rPr>
+          <w:color w:val="00B0F0"/>
+        </w:rPr>
+        <w:t>8</w:t>
+      </w:r>
+    </w:p>
+    <w:p>
+      <w:pPr>
+        <w:pStyle w:val="Titre2"/>
+        <w:spacing w:before="0"/>
+      </w:pPr>
+      <w:r>
+        <w:t xml:space="preserve">Chaque niveau : </w:t>
+      </w:r>
+    </w:p>
+    <w:p>
+      <w:pPr>
+        <w:spacing w:after="0"/>
+        <w:rPr>
+          <w:u w:val="single"/>
+        </w:rPr>
+      </w:pPr>
+    </w:p>
+    <w:p>
+      <w:pPr>
+        <w:spacing w:after="0"/>
+        <w:rPr>
           <w:u w:val="single"/>
         </w:rPr>
       </w:pPr>
@@ -5114,7 +4950,6 @@
         </w:rPr>
         <w:t xml:space="preserve">+ 1 mana </w:t>
       </w:r>
-      <w:proofErr w:type="gramStart"/>
       <w:r>
         <w:rPr>
           <w:u w:val="single"/>
@@ -5125,14 +4960,7 @@
         <w:rPr>
           <w:u w:val="single"/>
         </w:rPr>
-        <w:t xml:space="preserve"> +</w:t>
-      </w:r>
-      <w:proofErr w:type="gramEnd"/>
-      <w:r>
-        <w:rPr>
-          <w:u w:val="single"/>
-        </w:rPr>
-        <w:t xml:space="preserve"> 2 mana</w:t>
+        <w:t xml:space="preserve"> + 2 mana</w:t>
       </w:r>
       <w:r>
         <w:t xml:space="preserve"> </w:t>
@@ -5514,7 +5342,7 @@
           </w:tcPr>
           <w:p>
             <w:r>
-              <w:t>1</w:t>
+              <w:t>2</w:t>
             </w:r>
           </w:p>
         </w:tc>
@@ -5524,7 +5352,7 @@
           </w:tcPr>
           <w:p>
             <w:r>
-              <w:t>1</w:t>
+              <w:t>2</w:t>
             </w:r>
           </w:p>
         </w:tc>
@@ -5634,32 +5462,6 @@
         </w:tc>
       </w:tr>
     </w:tbl>
-    <w:p>
-      <w:pPr>
-        <w:spacing w:after="0"/>
-        <w:rPr>
-          <w:color w:val="00B0F0"/>
-        </w:rPr>
-      </w:pPr>
-      <w:r>
-        <w:rPr>
-          <w:color w:val="00B0F0"/>
-        </w:rPr>
-        <w:t>Dé de vie : 1d</w:t>
-      </w:r>
-      <w:r>
-        <w:rPr>
-          <w:color w:val="00B0F0"/>
-        </w:rPr>
-        <w:t>6</w:t>
-      </w:r>
-      <w:r>
-        <w:rPr>
-          <w:color w:val="00B0F0"/>
-        </w:rPr>
-        <w:t xml:space="preserve"> </w:t>
-      </w:r>
-    </w:p>
     <w:p>
       <w:pPr>
         <w:spacing w:after="0"/>
@@ -5846,7 +5648,89 @@
     <w:p>
       <w:pPr>
         <w:spacing w:after="0"/>
-      </w:pPr>
+        <w:rPr>
+          <w:color w:val="00B0F0"/>
+        </w:rPr>
+      </w:pPr>
+      <w:r>
+        <w:rPr>
+          <w:color w:val="00B0F0"/>
+        </w:rPr>
+        <w:t>Dé de vie : 1d</w:t>
+      </w:r>
+      <w:r>
+        <w:rPr>
+          <w:color w:val="00B0F0"/>
+        </w:rPr>
+        <w:t>6</w:t>
+      </w:r>
+    </w:p>
+    <w:p>
+      <w:pPr>
+        <w:pStyle w:val="Titre2"/>
+        <w:spacing w:before="0"/>
+      </w:pPr>
+      <w:r>
+        <w:t>Jusqu’au niveau 6</w:t>
+      </w:r>
+      <w:r>
+        <w:t xml:space="preserve"> : Choisir parmi </w:t>
+      </w:r>
+      <w:r>
+        <w:t>8</w:t>
+      </w:r>
+      <w:r>
+        <w:t xml:space="preserve"> mana,</w:t>
+      </w:r>
+      <w:r>
+        <w:t xml:space="preserve"> 4 action, 4</w:t>
+      </w:r>
+      <w:r>
+        <w:t xml:space="preserve"> critique</w:t>
+      </w:r>
+      <w:r>
+        <w:t xml:space="preserve">, </w:t>
+      </w:r>
+      <w:r>
+        <w:t>4</w:t>
+      </w:r>
+      <w:r>
+        <w:t xml:space="preserve"> </w:t>
+      </w:r>
+      <w:r>
+        <w:t>esquive</w:t>
+      </w:r>
+      <w:r>
+        <w:t xml:space="preserve">, 1 main, 1 pioche, </w:t>
+      </w:r>
+    </w:p>
+    <w:p>
+      <w:r>
+        <w:t>(15 sur 22) (+3 attributs par niveau)</w:t>
+      </w:r>
+      <w:r>
+        <w:br/>
+      </w:r>
+      <w:r>
+        <w:rPr>
+          <w:u w:val="single"/>
+        </w:rPr>
+        <w:t xml:space="preserve">Niveau </w:t>
+      </w:r>
+      <w:r>
+        <w:rPr>
+          <w:u w:val="single"/>
+        </w:rPr>
+        <w:t>1</w:t>
+      </w:r>
+      <w:r>
+        <w:rPr>
+          <w:u w:val="single"/>
+        </w:rPr>
+        <w:t> :</w:t>
+      </w:r>
+    </w:p>
+    <w:p>
       <w:r>
         <w:rPr>
           <w:u w:val="single"/>
@@ -5937,68 +5821,151 @@
         <w:rPr>
           <w:u w:val="single"/>
         </w:rPr>
-        <w:t>Niveau 2 : +2 mana</w:t>
-      </w:r>
-      <w:r>
-        <w:rPr>
-          <w:u w:val="single"/>
-        </w:rPr>
+        <w:t>Niveau 2 </w:t>
+      </w:r>
+      <w:r>
+        <w:rPr>
+          <w:u w:val="single"/>
+        </w:rPr>
+        <w:t>:</w:t>
+      </w:r>
+    </w:p>
+    <w:p>
+      <w:pPr>
+        <w:spacing w:after="0"/>
+      </w:pPr>
+      <w:r>
+        <w:rPr>
+          <w:u w:val="single"/>
+        </w:rPr>
+        <w:t>Sorts </w:t>
+      </w:r>
+      <w:r>
+        <w:rPr>
+          <w:u w:val="single"/>
+        </w:rPr>
+        <w:t>(+6)</w:t>
+      </w:r>
+      <w:r>
+        <w:rPr>
+          <w:u w:val="single"/>
+        </w:rPr>
+        <w:t xml:space="preserve"> 13</w:t>
+      </w:r>
+      <w:r>
+        <w:rPr>
+          <w:u w:val="single"/>
+        </w:rPr>
+        <w:t>:</w:t>
+      </w:r>
+      <w:r>
         <w:t xml:space="preserve"> </w:t>
       </w:r>
       <w:r>
-        <w:rPr>
-          <w:u w:val="single"/>
-        </w:rPr>
-        <w:t xml:space="preserve">/ +1 </w:t>
-      </w:r>
-      <w:proofErr w:type="gramStart"/>
-      <w:r>
-        <w:rPr>
-          <w:u w:val="single"/>
-        </w:rPr>
-        <w:t>critique  +</w:t>
-      </w:r>
-      <w:proofErr w:type="gramEnd"/>
-      <w:r>
-        <w:rPr>
-          <w:u w:val="single"/>
-        </w:rPr>
-        <w:t xml:space="preserve"> 1 action </w:t>
-      </w:r>
-      <w:r>
+        <w:t>Energie Lumineuse</w:t>
+      </w:r>
+      <w:r>
+        <w:t>X2</w:t>
+      </w:r>
+      <w:r>
+        <w:t xml:space="preserve">, </w:t>
+      </w:r>
+      <w:r>
+        <w:t>Malédiction</w:t>
+      </w:r>
+      <w:r>
+        <w:t>, Bouclier Magique, Récupération de Mana III</w:t>
+      </w:r>
+      <w:r>
+        <w:t>, Explosion d’arcanes</w:t>
+      </w:r>
+    </w:p>
+    <w:p>
+      <w:pPr>
+        <w:spacing w:after="0"/>
+      </w:pPr>
+    </w:p>
+    <w:p>
+      <w:pPr>
+        <w:spacing w:after="0"/>
+        <w:rPr>
+          <w:u w:val="single"/>
+        </w:rPr>
+      </w:pPr>
+      <w:r>
+        <w:rPr>
+          <w:u w:val="single"/>
+        </w:rPr>
+        <w:t>Niveau 3 </w:t>
+      </w:r>
+      <w:r>
+        <w:rPr>
+          <w:u w:val="single"/>
+        </w:rPr>
+        <w:t>:</w:t>
+      </w:r>
+    </w:p>
+    <w:p>
+      <w:pPr>
+        <w:spacing w:after="0"/>
+      </w:pPr>
+      <w:r>
+        <w:rPr>
+          <w:u w:val="single"/>
+        </w:rPr>
+        <w:t>Sorts </w:t>
+      </w:r>
+      <w:r>
+        <w:rPr>
+          <w:u w:val="single"/>
+        </w:rPr>
+        <w:t>(+7)</w:t>
+      </w:r>
+      <w:r>
+        <w:rPr>
+          <w:u w:val="single"/>
+        </w:rPr>
+        <w:t xml:space="preserve"> 20</w:t>
+      </w:r>
+      <w:r>
+        <w:rPr>
+          <w:u w:val="single"/>
+        </w:rPr>
+        <w:t>:</w:t>
+      </w:r>
+      <w:r>
+        <w:t xml:space="preserve"> </w:t>
+      </w:r>
+      <w:r>
+        <w:t xml:space="preserve">Pioche III, Energie Lumineuse, Bouclier Magique, </w:t>
+      </w:r>
+      <w:r>
+        <w:t>Malédiction</w:t>
+      </w:r>
+      <w:r>
+        <w:t xml:space="preserve"> Instantanée, Récupération de Mana III</w:t>
+      </w:r>
+      <w:r>
+        <w:t>, Soins d’urgence, Infusion de Mana</w:t>
+      </w:r>
+    </w:p>
+    <w:p>
+      <w:pPr>
+        <w:spacing w:after="0"/>
+      </w:pPr>
+    </w:p>
+    <w:p>
+      <w:pPr>
+        <w:spacing w:after="0"/>
         <w:rPr>
           <w:color w:val="FF0000"/>
         </w:rPr>
-        <w:t xml:space="preserve">+1 </w:t>
-      </w:r>
-      <w:r>
-        <w:rPr>
-          <w:color w:val="FF0000"/>
-        </w:rPr>
-        <w:t>main</w:t>
-      </w:r>
-    </w:p>
-    <w:p>
-      <w:pPr>
-        <w:spacing w:after="0"/>
-      </w:pPr>
-      <w:r>
-        <w:rPr>
-          <w:u w:val="single"/>
-        </w:rPr>
-        <w:t>Sorts </w:t>
-      </w:r>
-      <w:r>
-        <w:rPr>
-          <w:u w:val="single"/>
-        </w:rPr>
-        <w:t>(+6)</w:t>
-      </w:r>
-      <w:r>
-        <w:rPr>
-          <w:u w:val="single"/>
-        </w:rPr>
-        <w:t xml:space="preserve"> 13</w:t>
+      </w:pPr>
+      <w:r>
+        <w:rPr>
+          <w:u w:val="single"/>
+        </w:rPr>
+        <w:t>Niveau 4 </w:t>
       </w:r>
       <w:r>
         <w:rPr>
@@ -6006,23 +5973,64 @@
         </w:rPr>
         <w:t>:</w:t>
       </w:r>
+    </w:p>
+    <w:p>
+      <w:pPr>
+        <w:spacing w:after="0"/>
+      </w:pPr>
+      <w:r>
+        <w:rPr>
+          <w:u w:val="single"/>
+        </w:rPr>
+        <w:t>Sorts</w:t>
+      </w:r>
+      <w:r>
+        <w:rPr>
+          <w:u w:val="single"/>
+        </w:rPr>
+        <w:t xml:space="preserve"> (+8)</w:t>
+      </w:r>
+      <w:r>
+        <w:rPr>
+          <w:u w:val="single"/>
+        </w:rPr>
+        <w:t> </w:t>
+      </w:r>
+      <w:r>
+        <w:rPr>
+          <w:u w:val="single"/>
+        </w:rPr>
+        <w:t>28</w:t>
+      </w:r>
+      <w:r>
+        <w:rPr>
+          <w:u w:val="single"/>
+        </w:rPr>
+        <w:t>:</w:t>
+      </w:r>
       <w:r>
         <w:t xml:space="preserve"> </w:t>
       </w:r>
       <w:r>
-        <w:t>Energie Lumineuse</w:t>
-      </w:r>
-      <w:r>
-        <w:t>X2</w:t>
-      </w:r>
-      <w:r>
-        <w:t xml:space="preserve">, </w:t>
+        <w:t xml:space="preserve">Bouclier Magique, Exorcisme X2, </w:t>
       </w:r>
       <w:r>
         <w:t>Malédiction</w:t>
       </w:r>
       <w:r>
-        <w:t>, Bouclier Magique, Récupération de Mana III</w:t>
+        <w:t xml:space="preserve"> Instantanée, Booster de Tour V</w:t>
+      </w:r>
+      <w:r>
+        <w:t xml:space="preserve">, Bouclier </w:t>
+      </w:r>
+      <w:r>
+        <w:t>vengeur</w:t>
+      </w:r>
+      <w:r>
+        <w:t xml:space="preserve">, Bouclier </w:t>
+      </w:r>
+      <w:r>
+        <w:t>empathique</w:t>
       </w:r>
       <w:r>
         <w:t>, Explosion d’arcanes</w:t>
@@ -6044,225 +6052,13 @@
         <w:rPr>
           <w:u w:val="single"/>
         </w:rPr>
-        <w:t xml:space="preserve">Niveau 3 : </w:t>
-      </w:r>
-      <w:r>
-        <w:rPr>
-          <w:u w:val="single"/>
-        </w:rPr>
-        <w:t xml:space="preserve">+1 mana + 1 action </w:t>
-      </w:r>
-      <w:proofErr w:type="gramStart"/>
-      <w:r>
-        <w:rPr>
-          <w:u w:val="single"/>
-        </w:rPr>
-        <w:t>/  +</w:t>
-      </w:r>
-      <w:proofErr w:type="gramEnd"/>
-      <w:r>
-        <w:rPr>
-          <w:u w:val="single"/>
-        </w:rPr>
-        <w:t xml:space="preserve"> 1 esquive + 1 mana</w:t>
-      </w:r>
-    </w:p>
-    <w:p>
-      <w:pPr>
-        <w:spacing w:after="0"/>
-      </w:pPr>
-      <w:r>
-        <w:rPr>
-          <w:u w:val="single"/>
-        </w:rPr>
-        <w:t>Sorts </w:t>
-      </w:r>
-      <w:r>
-        <w:rPr>
-          <w:u w:val="single"/>
-        </w:rPr>
-        <w:t>(+7)</w:t>
-      </w:r>
-      <w:r>
-        <w:rPr>
-          <w:u w:val="single"/>
-        </w:rPr>
-        <w:t xml:space="preserve"> 20</w:t>
+        <w:t>Niveau 5 </w:t>
       </w:r>
       <w:r>
         <w:rPr>
           <w:u w:val="single"/>
         </w:rPr>
         <w:t>:</w:t>
-      </w:r>
-      <w:r>
-        <w:t xml:space="preserve"> </w:t>
-      </w:r>
-      <w:r>
-        <w:t xml:space="preserve">Pioche III, Energie Lumineuse, Bouclier Magique, </w:t>
-      </w:r>
-      <w:r>
-        <w:t>Malédiction</w:t>
-      </w:r>
-      <w:r>
-        <w:t xml:space="preserve"> Instantanée, Récupération de Mana III</w:t>
-      </w:r>
-      <w:r>
-        <w:t>, Soins d’urgence, Infusion de Mana</w:t>
-      </w:r>
-    </w:p>
-    <w:p>
-      <w:pPr>
-        <w:spacing w:after="0"/>
-      </w:pPr>
-    </w:p>
-    <w:p>
-      <w:pPr>
-        <w:spacing w:after="0"/>
-        <w:rPr>
-          <w:color w:val="FF0000"/>
-        </w:rPr>
-      </w:pPr>
-      <w:r>
-        <w:rPr>
-          <w:u w:val="single"/>
-        </w:rPr>
-        <w:t>Niveau 4 : +</w:t>
-      </w:r>
-      <w:r>
-        <w:rPr>
-          <w:u w:val="single"/>
-        </w:rPr>
-        <w:t>2</w:t>
-      </w:r>
-      <w:r>
-        <w:rPr>
-          <w:u w:val="single"/>
-        </w:rPr>
-        <w:t xml:space="preserve"> mana / +1 critique + </w:t>
-      </w:r>
-      <w:r>
-        <w:rPr>
-          <w:u w:val="single"/>
-        </w:rPr>
-        <w:t>1</w:t>
-      </w:r>
-      <w:r>
-        <w:rPr>
-          <w:u w:val="single"/>
-        </w:rPr>
-        <w:t xml:space="preserve"> action </w:t>
-      </w:r>
-      <w:r>
-        <w:rPr>
-          <w:color w:val="FF0000"/>
-        </w:rPr>
-        <w:t xml:space="preserve">+1 </w:t>
-      </w:r>
-      <w:r>
-        <w:rPr>
-          <w:color w:val="FF0000"/>
-        </w:rPr>
-        <w:t>pioche</w:t>
-      </w:r>
-    </w:p>
-    <w:p>
-      <w:pPr>
-        <w:spacing w:after="0"/>
-      </w:pPr>
-      <w:r>
-        <w:rPr>
-          <w:u w:val="single"/>
-        </w:rPr>
-        <w:t>Sorts</w:t>
-      </w:r>
-      <w:r>
-        <w:rPr>
-          <w:u w:val="single"/>
-        </w:rPr>
-        <w:t xml:space="preserve"> (+8)</w:t>
-      </w:r>
-      <w:r>
-        <w:rPr>
-          <w:u w:val="single"/>
-        </w:rPr>
-        <w:t> </w:t>
-      </w:r>
-      <w:r>
-        <w:rPr>
-          <w:u w:val="single"/>
-        </w:rPr>
-        <w:t>28</w:t>
-      </w:r>
-      <w:r>
-        <w:rPr>
-          <w:u w:val="single"/>
-        </w:rPr>
-        <w:t>:</w:t>
-      </w:r>
-      <w:r>
-        <w:t xml:space="preserve"> </w:t>
-      </w:r>
-      <w:r>
-        <w:t xml:space="preserve">Bouclier Magique, Exorcisme X2, </w:t>
-      </w:r>
-      <w:r>
-        <w:t>Malédiction</w:t>
-      </w:r>
-      <w:r>
-        <w:t xml:space="preserve"> Instantanée, Booster de Tour V</w:t>
-      </w:r>
-      <w:r>
-        <w:t xml:space="preserve">, Bouclier </w:t>
-      </w:r>
-      <w:r>
-        <w:t>vengeur</w:t>
-      </w:r>
-      <w:r>
-        <w:t xml:space="preserve">, Bouclier </w:t>
-      </w:r>
-      <w:r>
-        <w:t>empathique</w:t>
-      </w:r>
-      <w:r>
-        <w:t>, Explosion d’arcanes</w:t>
-      </w:r>
-    </w:p>
-    <w:p>
-      <w:pPr>
-        <w:spacing w:after="0"/>
-      </w:pPr>
-    </w:p>
-    <w:p>
-      <w:pPr>
-        <w:spacing w:after="0"/>
-        <w:rPr>
-          <w:u w:val="single"/>
-        </w:rPr>
-      </w:pPr>
-      <w:r>
-        <w:rPr>
-          <w:u w:val="single"/>
-        </w:rPr>
-        <w:t xml:space="preserve">Niveau 5 : </w:t>
-      </w:r>
-      <w:r>
-        <w:rPr>
-          <w:u w:val="single"/>
-        </w:rPr>
-        <w:t xml:space="preserve">+2 mana / +1 esquive + </w:t>
-      </w:r>
-      <w:r>
-        <w:rPr>
-          <w:u w:val="single"/>
-        </w:rPr>
-        <w:t>1</w:t>
-      </w:r>
-      <w:r>
-        <w:rPr>
-          <w:u w:val="single"/>
-        </w:rPr>
-        <w:t xml:space="preserve"> action</w:t>
       </w:r>
     </w:p>
     <w:p>
@@ -6473,7 +6269,7 @@
           </w:tcPr>
           <w:p>
             <w:r>
-              <w:t>7</w:t>
+              <w:t>10</w:t>
             </w:r>
           </w:p>
         </w:tc>
@@ -6588,7 +6384,10 @@
           </w:tcPr>
           <w:p>
             <w:r>
-              <w:t>10</w:t>
+              <w:t>1</w:t>
+            </w:r>
+            <w:r>
+              <w:t>2</w:t>
             </w:r>
           </w:p>
         </w:tc>
@@ -6623,7 +6422,7 @@
           </w:tcPr>
           <w:p>
             <w:r>
-              <w:t>2</w:t>
+              <w:t>3</w:t>
             </w:r>
           </w:p>
         </w:tc>
@@ -6705,7 +6504,10 @@
           </w:tcPr>
           <w:p>
             <w:r>
-              <w:t>13</w:t>
+              <w:t>1</w:t>
+            </w:r>
+            <w:r>
+              <w:t>4</w:t>
             </w:r>
           </w:p>
         </w:tc>
@@ -6806,26 +6608,6 @@
         </w:tc>
       </w:tr>
     </w:tbl>
-    <w:p>
-      <w:pPr>
-        <w:spacing w:after="0"/>
-        <w:rPr>
-          <w:color w:val="00B0F0"/>
-        </w:rPr>
-      </w:pPr>
-      <w:r>
-        <w:rPr>
-          <w:color w:val="00B0F0"/>
-        </w:rPr>
-        <w:t>Dé de vie : 1d</w:t>
-      </w:r>
-      <w:r>
-        <w:rPr>
-          <w:color w:val="00B0F0"/>
-        </w:rPr>
-        <w:t>8</w:t>
-      </w:r>
-    </w:p>
     <w:p>
       <w:pPr>
         <w:spacing w:after="0"/>
@@ -7013,14 +6795,89 @@
       <w:pPr>
         <w:spacing w:after="0"/>
         <w:rPr>
-          <w:u w:val="single"/>
-        </w:rPr>
-      </w:pPr>
-    </w:p>
-    <w:p>
-      <w:pPr>
-        <w:spacing w:after="0"/>
-      </w:pPr>
+          <w:color w:val="00B0F0"/>
+        </w:rPr>
+      </w:pPr>
+      <w:r>
+        <w:rPr>
+          <w:color w:val="00B0F0"/>
+        </w:rPr>
+        <w:t>Dé de vie : 1d</w:t>
+      </w:r>
+      <w:r>
+        <w:rPr>
+          <w:color w:val="00B0F0"/>
+        </w:rPr>
+        <w:t>8</w:t>
+      </w:r>
+    </w:p>
+    <w:p>
+      <w:pPr>
+        <w:pStyle w:val="Titre2"/>
+        <w:spacing w:before="0"/>
+      </w:pPr>
+      <w:r>
+        <w:t>Jusqu’au niveau 6</w:t>
+      </w:r>
+      <w:r>
+        <w:t xml:space="preserve"> : Choisir parmi 4 mana, </w:t>
+      </w:r>
+      <w:r>
+        <w:t>4</w:t>
+      </w:r>
+      <w:r>
+        <w:t xml:space="preserve"> action, </w:t>
+      </w:r>
+      <w:r>
+        <w:t>6</w:t>
+      </w:r>
+      <w:r>
+        <w:t xml:space="preserve"> esquive, </w:t>
+      </w:r>
+      <w:r>
+        <w:t>4</w:t>
+      </w:r>
+      <w:r>
+        <w:t xml:space="preserve"> zèle, </w:t>
+      </w:r>
+      <w:r>
+        <w:t>4</w:t>
+      </w:r>
+      <w:r>
+        <w:t xml:space="preserve"> main</w:t>
+      </w:r>
+      <w:r>
+        <w:t>, 2 déplacement</w:t>
+      </w:r>
+    </w:p>
+    <w:p>
+      <w:r>
+        <w:t>(15 sur 2</w:t>
+      </w:r>
+      <w:r>
+        <w:t>4</w:t>
+      </w:r>
+      <w:r>
+        <w:t>) (+3 attributs par niveau)</w:t>
+      </w:r>
+    </w:p>
+    <w:p>
+      <w:pPr>
+        <w:rPr>
+          <w:u w:val="single"/>
+        </w:rPr>
+      </w:pPr>
+      <w:r>
+        <w:t>Niveau 1 </w:t>
+      </w:r>
+      <w:r>
+        <w:rPr>
+          <w:u w:val="single"/>
+        </w:rPr>
+        <w:t xml:space="preserve"> </w:t>
+      </w:r>
+    </w:p>
+    <w:p>
       <w:r>
         <w:rPr>
           <w:u w:val="single"/>
@@ -7080,6 +6937,11 @@
     <w:p>
       <w:pPr>
         <w:spacing w:after="0"/>
+      </w:pPr>
+    </w:p>
+    <w:p>
+      <w:pPr>
+        <w:spacing w:after="0"/>
         <w:rPr>
           <w:color w:val="FF0000"/>
         </w:rPr>
@@ -7088,45 +6950,169 @@
         <w:rPr>
           <w:u w:val="single"/>
         </w:rPr>
-        <w:t>Niveau 2 : +</w:t>
-      </w:r>
-      <w:r>
-        <w:rPr>
-          <w:u w:val="single"/>
-        </w:rPr>
-        <w:t>1</w:t>
-      </w:r>
-      <w:r>
-        <w:rPr>
-          <w:u w:val="single"/>
-        </w:rPr>
-        <w:t xml:space="preserve"> mana + 1 esquive /+ 1 </w:t>
-      </w:r>
-      <w:proofErr w:type="spellStart"/>
-      <w:r>
-        <w:rPr>
-          <w:u w:val="single"/>
-        </w:rPr>
-        <w:t>zele</w:t>
-      </w:r>
-      <w:proofErr w:type="spellEnd"/>
-      <w:r>
-        <w:rPr>
-          <w:u w:val="single"/>
-        </w:rPr>
-        <w:t xml:space="preserve"> + 1 action </w:t>
-      </w:r>
-      <w:r>
+        <w:t>Niveau 2 </w:t>
+      </w:r>
+    </w:p>
+    <w:p>
+      <w:pPr>
+        <w:spacing w:after="0"/>
+        <w:rPr>
+          <w:u w:val="single"/>
+        </w:rPr>
+      </w:pPr>
+      <w:r>
+        <w:rPr>
+          <w:u w:val="single"/>
+        </w:rPr>
+        <w:t>Sorts</w:t>
+      </w:r>
+      <w:r>
+        <w:rPr>
+          <w:u w:val="single"/>
+        </w:rPr>
+        <w:t xml:space="preserve"> (+4</w:t>
+      </w:r>
+      <w:r>
+        <w:rPr>
+          <w:u w:val="single"/>
+        </w:rPr>
+        <w:t> : 1</w:t>
+      </w:r>
+      <w:r>
+        <w:rPr>
+          <w:u w:val="single"/>
+        </w:rPr>
+        <w:t>8</w:t>
+      </w:r>
+      <w:r>
+        <w:rPr>
+          <w:u w:val="single"/>
+        </w:rPr>
+        <w:t>)</w:t>
+      </w:r>
+      <w:r>
+        <w:rPr>
+          <w:u w:val="single"/>
+        </w:rPr>
+        <w:t> :</w:t>
+      </w:r>
+      <w:r>
+        <w:rPr>
+          <w:u w:val="single"/>
+        </w:rPr>
+        <w:t xml:space="preserve"> Cape inhibitrice, Coup gauche</w:t>
+      </w:r>
+      <w:r>
+        <w:rPr>
+          <w:u w:val="single"/>
+        </w:rPr>
+        <w:t>X2</w:t>
+      </w:r>
+      <w:r>
+        <w:rPr>
+          <w:u w:val="single"/>
+        </w:rPr>
+        <w:t xml:space="preserve">, </w:t>
+      </w:r>
+      <w:r>
+        <w:rPr>
+          <w:u w:val="single"/>
+        </w:rPr>
+        <w:t>Vive esquive,</w:t>
+      </w:r>
+    </w:p>
+    <w:p>
+      <w:pPr>
+        <w:spacing w:after="0"/>
+      </w:pPr>
+    </w:p>
+    <w:p>
+      <w:pPr>
+        <w:spacing w:after="0"/>
         <w:rPr>
           <w:color w:val="FF0000"/>
         </w:rPr>
-        <w:t xml:space="preserve">+1 </w:t>
-      </w:r>
-      <w:r>
+      </w:pPr>
+      <w:r>
+        <w:rPr>
+          <w:u w:val="single"/>
+        </w:rPr>
+        <w:t>Niveau 3 </w:t>
+      </w:r>
+    </w:p>
+    <w:p>
+      <w:pPr>
+        <w:spacing w:after="0"/>
+        <w:rPr>
+          <w:u w:val="single"/>
+        </w:rPr>
+      </w:pPr>
+      <w:r>
+        <w:rPr>
+          <w:u w:val="single"/>
+        </w:rPr>
+        <w:t>Sorts</w:t>
+      </w:r>
+      <w:r>
+        <w:rPr>
+          <w:u w:val="single"/>
+        </w:rPr>
+        <w:t xml:space="preserve"> (+6 : 24</w:t>
+      </w:r>
+      <w:r>
+        <w:rPr>
+          <w:u w:val="single"/>
+        </w:rPr>
+        <w:t>)</w:t>
+      </w:r>
+      <w:r>
+        <w:rPr>
+          <w:u w:val="single"/>
+        </w:rPr>
+        <w:t> :</w:t>
+      </w:r>
+      <w:r>
+        <w:rPr>
+          <w:u w:val="single"/>
+        </w:rPr>
+        <w:t xml:space="preserve"> </w:t>
+      </w:r>
+      <w:r>
+        <w:rPr>
+          <w:u w:val="single"/>
+        </w:rPr>
+        <w:t>Booster de Tour</w:t>
+      </w:r>
+      <w:r>
+        <w:rPr>
+          <w:u w:val="single"/>
+        </w:rPr>
+        <w:t>, Cape inhibitrice</w:t>
+      </w:r>
+      <w:r>
+        <w:rPr>
+          <w:u w:val="single"/>
+        </w:rPr>
+        <w:t>, Méditation Zen, Bouclier zélé, Récupération de Mana, Lame fantôme</w:t>
+      </w:r>
+    </w:p>
+    <w:p>
+      <w:pPr>
+        <w:spacing w:after="0"/>
+      </w:pPr>
+    </w:p>
+    <w:p>
+      <w:pPr>
+        <w:spacing w:after="0"/>
         <w:rPr>
           <w:color w:val="FF0000"/>
         </w:rPr>
-        <w:t>main</w:t>
+      </w:pPr>
+      <w:r>
+        <w:rPr>
+          <w:u w:val="single"/>
+        </w:rPr>
+        <w:t>Niveau 4 </w:t>
       </w:r>
     </w:p>
     <w:p>
@@ -7146,25 +7132,19 @@
         <w:rPr>
           <w:u w:val="single"/>
         </w:rPr>
-        <w:t xml:space="preserve"> (+4</w:t>
-      </w:r>
-      <w:r>
-        <w:rPr>
-          <w:u w:val="single"/>
-        </w:rPr>
-        <w:t> : 1</w:t>
-      </w:r>
-      <w:r>
-        <w:rPr>
-          <w:u w:val="single"/>
-        </w:rPr>
-        <w:t>8</w:t>
-      </w:r>
-      <w:r>
-        <w:rPr>
-          <w:u w:val="single"/>
-        </w:rPr>
-        <w:t>)</w:t>
+        <w:t xml:space="preserve"> (+</w:t>
+      </w:r>
+      <w:r>
+        <w:rPr>
+          <w:u w:val="single"/>
+        </w:rPr>
+        <w:t>6</w:t>
+      </w:r>
+      <w:r>
+        <w:rPr>
+          <w:u w:val="single"/>
+        </w:rPr>
+        <w:t> : 30)</w:t>
       </w:r>
       <w:r>
         <w:rPr>
@@ -7176,25 +7156,13 @@
         <w:rPr>
           <w:u w:val="single"/>
         </w:rPr>
-        <w:t xml:space="preserve"> Cape inhibitrice, Coup gauche</w:t>
-      </w:r>
-      <w:r>
-        <w:rPr>
-          <w:u w:val="single"/>
-        </w:rPr>
-        <w:t>X2</w:t>
-      </w:r>
-      <w:r>
-        <w:rPr>
-          <w:u w:val="single"/>
-        </w:rPr>
-        <w:t xml:space="preserve">, </w:t>
-      </w:r>
-      <w:r>
-        <w:rPr>
-          <w:u w:val="single"/>
-        </w:rPr>
-        <w:t>Vive esquive,</w:t>
+        <w:t xml:space="preserve"> Cape inhibitrice</w:t>
+      </w:r>
+      <w:r>
+        <w:rPr>
+          <w:u w:val="single"/>
+        </w:rPr>
+        <w:t>, Combo, Conversion, Dissimulation, Souffle de Ki, Booster de Tour</w:t>
       </w:r>
     </w:p>
     <w:p>
@@ -7213,247 +7181,7 @@
         <w:rPr>
           <w:u w:val="single"/>
         </w:rPr>
-        <w:t xml:space="preserve">Niveau 3 : + 1 </w:t>
-      </w:r>
-      <w:proofErr w:type="gramStart"/>
-      <w:r>
-        <w:rPr>
-          <w:u w:val="single"/>
-        </w:rPr>
-        <w:t>action  +</w:t>
-      </w:r>
-      <w:proofErr w:type="gramEnd"/>
-      <w:r>
-        <w:rPr>
-          <w:u w:val="single"/>
-        </w:rPr>
-        <w:t xml:space="preserve"> 1 mana / +1 esquive  +1  déplacement </w:t>
-      </w:r>
-      <w:r>
-        <w:rPr>
-          <w:color w:val="FF0000"/>
-        </w:rPr>
-        <w:t xml:space="preserve">+1 </w:t>
-      </w:r>
-      <w:r>
-        <w:rPr>
-          <w:color w:val="FF0000"/>
-        </w:rPr>
-        <w:t>main</w:t>
-      </w:r>
-    </w:p>
-    <w:p>
-      <w:pPr>
-        <w:spacing w:after="0"/>
-        <w:rPr>
-          <w:u w:val="single"/>
-        </w:rPr>
-      </w:pPr>
-      <w:r>
-        <w:rPr>
-          <w:u w:val="single"/>
-        </w:rPr>
-        <w:t>Sorts</w:t>
-      </w:r>
-      <w:r>
-        <w:rPr>
-          <w:u w:val="single"/>
-        </w:rPr>
-        <w:t xml:space="preserve"> (+6 : 24</w:t>
-      </w:r>
-      <w:r>
-        <w:rPr>
-          <w:u w:val="single"/>
-        </w:rPr>
-        <w:t>)</w:t>
-      </w:r>
-      <w:r>
-        <w:rPr>
-          <w:u w:val="single"/>
-        </w:rPr>
-        <w:t> :</w:t>
-      </w:r>
-      <w:r>
-        <w:rPr>
-          <w:u w:val="single"/>
-        </w:rPr>
-        <w:t xml:space="preserve"> </w:t>
-      </w:r>
-      <w:r>
-        <w:rPr>
-          <w:u w:val="single"/>
-        </w:rPr>
-        <w:t>Booster de Tour</w:t>
-      </w:r>
-      <w:r>
-        <w:rPr>
-          <w:u w:val="single"/>
-        </w:rPr>
-        <w:t>, Cape inhibitrice</w:t>
-      </w:r>
-      <w:r>
-        <w:rPr>
-          <w:u w:val="single"/>
-        </w:rPr>
-        <w:t>, Méditation Zen, Bouclier zélé, Récupération de Mana, Lame fantôme</w:t>
-      </w:r>
-    </w:p>
-    <w:p>
-      <w:pPr>
-        <w:spacing w:after="0"/>
-      </w:pPr>
-    </w:p>
-    <w:p>
-      <w:pPr>
-        <w:spacing w:after="0"/>
-        <w:rPr>
-          <w:color w:val="FF0000"/>
-        </w:rPr>
-      </w:pPr>
-      <w:r>
-        <w:rPr>
-          <w:u w:val="single"/>
-        </w:rPr>
-        <w:t xml:space="preserve">Niveau 4 : +2 action </w:t>
-      </w:r>
-      <w:r>
-        <w:rPr>
-          <w:u w:val="single"/>
-        </w:rPr>
-        <w:t>+1 mana</w:t>
-      </w:r>
-      <w:r>
-        <w:rPr>
-          <w:u w:val="single"/>
-        </w:rPr>
-        <w:t xml:space="preserve">/ +2 esquive +1 mana </w:t>
-      </w:r>
-      <w:r>
-        <w:rPr>
-          <w:color w:val="FF0000"/>
-        </w:rPr>
-        <w:t xml:space="preserve">+1 </w:t>
-      </w:r>
-      <w:r>
-        <w:rPr>
-          <w:color w:val="FF0000"/>
-        </w:rPr>
-        <w:t>main</w:t>
-      </w:r>
-      <w:r>
-        <w:rPr>
-          <w:u w:val="single"/>
-        </w:rPr>
-        <w:t xml:space="preserve"> </w:t>
-      </w:r>
-    </w:p>
-    <w:p>
-      <w:pPr>
-        <w:spacing w:after="0"/>
-        <w:rPr>
-          <w:u w:val="single"/>
-        </w:rPr>
-      </w:pPr>
-      <w:r>
-        <w:rPr>
-          <w:u w:val="single"/>
-        </w:rPr>
-        <w:t>Sorts</w:t>
-      </w:r>
-      <w:r>
-        <w:rPr>
-          <w:u w:val="single"/>
-        </w:rPr>
-        <w:t xml:space="preserve"> (+</w:t>
-      </w:r>
-      <w:r>
-        <w:rPr>
-          <w:u w:val="single"/>
-        </w:rPr>
-        <w:t>6</w:t>
-      </w:r>
-      <w:r>
-        <w:rPr>
-          <w:u w:val="single"/>
-        </w:rPr>
-        <w:t> : 30)</w:t>
-      </w:r>
-      <w:r>
-        <w:rPr>
-          <w:u w:val="single"/>
-        </w:rPr>
-        <w:t> :</w:t>
-      </w:r>
-      <w:r>
-        <w:rPr>
-          <w:u w:val="single"/>
-        </w:rPr>
-        <w:t xml:space="preserve"> Cape inhibitrice</w:t>
-      </w:r>
-      <w:r>
-        <w:rPr>
-          <w:u w:val="single"/>
-        </w:rPr>
-        <w:t>, Combo, Conversion, Dissimulation, Souffle de Ki, Booster de Tour</w:t>
-      </w:r>
-    </w:p>
-    <w:p>
-      <w:pPr>
-        <w:spacing w:after="0"/>
-      </w:pPr>
-    </w:p>
-    <w:p>
-      <w:pPr>
-        <w:spacing w:after="0"/>
-        <w:rPr>
-          <w:color w:val="FF0000"/>
-        </w:rPr>
-      </w:pPr>
-      <w:r>
-        <w:rPr>
-          <w:u w:val="single"/>
-        </w:rPr>
-        <w:t xml:space="preserve">Niveau 5 : +2 action + 1 </w:t>
-      </w:r>
-      <w:proofErr w:type="spellStart"/>
-      <w:r>
-        <w:rPr>
-          <w:u w:val="single"/>
-        </w:rPr>
-        <w:t>zele</w:t>
-      </w:r>
-      <w:proofErr w:type="spellEnd"/>
-      <w:r>
-        <w:rPr>
-          <w:u w:val="single"/>
-        </w:rPr>
-        <w:t xml:space="preserve"> / +2 esquive + 1 </w:t>
-      </w:r>
-      <w:proofErr w:type="spellStart"/>
-      <w:r>
-        <w:rPr>
-          <w:u w:val="single"/>
-        </w:rPr>
-        <w:t>deplacement</w:t>
-      </w:r>
-      <w:proofErr w:type="spellEnd"/>
-      <w:r>
-        <w:rPr>
-          <w:u w:val="single"/>
-        </w:rPr>
-        <w:t xml:space="preserve"> </w:t>
-      </w:r>
-      <w:r>
-        <w:rPr>
-          <w:color w:val="FF0000"/>
-        </w:rPr>
-        <w:t xml:space="preserve">+1 </w:t>
-      </w:r>
-      <w:r>
-        <w:rPr>
-          <w:color w:val="FF0000"/>
-        </w:rPr>
-        <w:t>main</w:t>
+        <w:t>Niveau 5 </w:t>
       </w:r>
     </w:p>
     <w:p>
@@ -8368,21 +8096,7 @@
         <w:rPr>
           <w:u w:val="single"/>
         </w:rPr>
-        <w:t xml:space="preserve">Niveau 3 : + 1 </w:t>
-      </w:r>
-      <w:proofErr w:type="gramStart"/>
-      <w:r>
-        <w:rPr>
-          <w:u w:val="single"/>
-        </w:rPr>
-        <w:t>critique  +</w:t>
-      </w:r>
-      <w:proofErr w:type="gramEnd"/>
-      <w:r>
-        <w:rPr>
-          <w:u w:val="single"/>
-        </w:rPr>
-        <w:t xml:space="preserve"> 1 mana / +1 esquive  +1  mana </w:t>
+        <w:t xml:space="preserve">Niveau 3 : + 1 critique  + 1 mana / +1 esquive  +1  mana </w:t>
       </w:r>
       <w:r>
         <w:rPr>
@@ -8444,21 +8158,7 @@
         <w:rPr>
           <w:u w:val="single"/>
         </w:rPr>
-        <w:t xml:space="preserve">Niveau 5 :  +1 </w:t>
-      </w:r>
-      <w:proofErr w:type="gramStart"/>
-      <w:r>
-        <w:rPr>
-          <w:u w:val="single"/>
-        </w:rPr>
-        <w:t>esquive  +</w:t>
-      </w:r>
-      <w:proofErr w:type="gramEnd"/>
-      <w:r>
-        <w:rPr>
-          <w:u w:val="single"/>
-        </w:rPr>
-        <w:t xml:space="preserve">1 action/ +1 critique +1 mana </w:t>
+        <w:t xml:space="preserve">Niveau 5 :  +1 esquive  +1 action/ +1 critique +1 mana </w:t>
       </w:r>
       <w:r>
         <w:rPr>
@@ -9186,21 +8886,7 @@
         <w:rPr>
           <w:u w:val="single"/>
         </w:rPr>
-        <w:t xml:space="preserve">Niveau 3 : + 1 </w:t>
-      </w:r>
-      <w:proofErr w:type="gramStart"/>
-      <w:r>
-        <w:rPr>
-          <w:u w:val="single"/>
-        </w:rPr>
-        <w:t>action  +</w:t>
-      </w:r>
-      <w:proofErr w:type="gramEnd"/>
-      <w:r>
-        <w:rPr>
-          <w:u w:val="single"/>
-        </w:rPr>
-        <w:t xml:space="preserve"> 1 mana / +1 esquive  +1  mana </w:t>
+        <w:t xml:space="preserve">Niveau 3 : + 1 action  + 1 mana / +1 esquive  +1  mana </w:t>
       </w:r>
       <w:r>
         <w:rPr>
@@ -9228,27 +8914,13 @@
         <w:rPr>
           <w:u w:val="single"/>
         </w:rPr>
-        <w:t xml:space="preserve">Niveau 4 : +1 action +1 esquive / +2 </w:t>
-      </w:r>
-      <w:proofErr w:type="gramStart"/>
-      <w:r>
-        <w:rPr>
-          <w:u w:val="single"/>
-        </w:rPr>
-        <w:t xml:space="preserve">mana  </w:t>
+        <w:t xml:space="preserve">Niveau 4 : +1 action +1 esquive / +2 mana  </w:t>
       </w:r>
       <w:r>
         <w:rPr>
           <w:color w:val="FF0000"/>
         </w:rPr>
-        <w:t>+</w:t>
-      </w:r>
-      <w:proofErr w:type="gramEnd"/>
-      <w:r>
-        <w:rPr>
-          <w:color w:val="FF0000"/>
-        </w:rPr>
-        <w:t xml:space="preserve">1 </w:t>
+        <w:t xml:space="preserve">+1 </w:t>
       </w:r>
       <w:r>
         <w:rPr>
@@ -10070,7 +9742,6 @@
         </w:rPr>
         <w:t xml:space="preserve">Niveau 3 : + 1 </w:t>
       </w:r>
-      <w:proofErr w:type="gramStart"/>
       <w:r>
         <w:rPr>
           <w:u w:val="single"/>
@@ -10081,14 +9752,7 @@
         <w:rPr>
           <w:u w:val="single"/>
         </w:rPr>
-        <w:t xml:space="preserve">  +</w:t>
-      </w:r>
-      <w:proofErr w:type="gramEnd"/>
-      <w:r>
-        <w:rPr>
-          <w:u w:val="single"/>
-        </w:rPr>
-        <w:t xml:space="preserve"> 1 </w:t>
+        <w:t xml:space="preserve">  + 1 </w:t>
       </w:r>
       <w:proofErr w:type="spellStart"/>
       <w:r>

</xml_diff>